<commit_message>
docs: gambar dibungkus kotak + semua tabel/kotak full-width margin-ke-margin
- add_image: gambar dibungkus tabel 1-sel berbingkai, full-width, gambar mengisi & di tengah, caption tetap di bawah
- make_table + tabel matriks: lebar 100% area teks (sejajar margin kiri-kanan)
- jarak 1 enter sebelum tiap kotak gambar
</commit_message>
<xml_diff>
--- a/Laporan_Kelompok10_UTS_DataMining_TitikTerjauh.docx
+++ b/Laporan_Kelompok10_UTS_DataMining_TitikTerjauh.docx
@@ -910,7 +910,7 @@
       <w:r>
         <w:t>4.3.3 Kode Program</w:t>
         <w:tab/>
-        <w:t>24</w:t>
+        <w:t>25</w:t>
       </w:r>
     </w:p>
     <w:p>
@@ -938,7 +938,7 @@
       <w:r>
         <w:t>4.4 Analisis Pengaruh Centroid Awal terhadap Outlier</w:t>
         <w:tab/>
-        <w:t>29</w:t>
+        <w:t>30</w:t>
       </w:r>
     </w:p>
     <w:p>
@@ -955,7 +955,7 @@
         </w:rPr>
         <w:t>BAB V PENUTUP</w:t>
         <w:tab/>
-        <w:t>31</w:t>
+        <w:t>32</w:t>
       </w:r>
     </w:p>
     <w:p>
@@ -969,7 +969,7 @@
       <w:r>
         <w:t>5.1 Kesimpulan</w:t>
         <w:tab/>
-        <w:t>31</w:t>
+        <w:t>32</w:t>
       </w:r>
     </w:p>
     <w:p>
@@ -983,7 +983,7 @@
       <w:r>
         <w:t>5.2 Saran</w:t>
         <w:tab/>
-        <w:t>32</w:t>
+        <w:t>33</w:t>
       </w:r>
     </w:p>
     <w:p>
@@ -1000,7 +1000,7 @@
         </w:rPr>
         <w:t>DAFTAR PUSTAKA</w:t>
         <w:tab/>
-        <w:t>33</w:t>
+        <w:t>34</w:t>
       </w:r>
     </w:p>
     <w:p>
@@ -1120,7 +1120,7 @@
         </w:rPr>
         <w:t>Gambar 4.6 Dendrogram Agglomerative Single Linkage</w:t>
         <w:tab/>
-        <w:t>25</w:t>
+        <w:t>26</w:t>
       </w:r>
     </w:p>
     <w:p>
@@ -1137,7 +1137,7 @@
         </w:rPr>
         <w:t>Gambar 4.7 Hasil Pengelompokan Tiga Klaster</w:t>
         <w:tab/>
-        <w:t>26</w:t>
+        <w:t>27</w:t>
       </w:r>
     </w:p>
     <w:p>
@@ -1171,7 +1171,7 @@
         </w:rPr>
         <w:t>Gambar 4.9 Perbandingan Empat Metode Linkage</w:t>
         <w:tab/>
-        <w:t>27</w:t>
+        <w:t>28</w:t>
       </w:r>
     </w:p>
     <w:p>
@@ -1188,7 +1188,7 @@
         </w:rPr>
         <w:t>Gambar 4.10 Perbandingan Centroid Awal di Dalam vs di Luar Layer</w:t>
         <w:tab/>
-        <w:t>30</w:t>
+        <w:t>31</w:t>
       </w:r>
     </w:p>
     <w:p>
@@ -1496,7 +1496,7 @@
         </w:rPr>
         <w:t>Tabel 4.13 Perbandingan Centroid Awal di Dalam vs di Luar Layer</w:t>
         <w:tab/>
-        <w:t>29</w:t>
+        <w:t>30</w:t>
       </w:r>
     </w:p>
     <w:p>
@@ -4108,7 +4108,6 @@
     </w:p>
     <w:tbl>
       <w:tblPr>
-        <w:tblW w:type="auto" w:w="0"/>
         <w:jc w:val="center"/>
         <w:tblLook w:firstColumn="1" w:firstRow="1" w:lastColumn="0" w:lastRow="0" w:noHBand="0" w:noVBand="1" w:val="04A0"/>
         <w:tblBorders>
@@ -4119,6 +4118,7 @@
           <w:insideH w:val="single" w:sz="4" w:space="0" w:color="000000"/>
           <w:insideV w:val="single" w:sz="4" w:space="0" w:color="000000"/>
         </w:tblBorders>
+        <w:tblW w:type="pct" w:w="5000"/>
       </w:tblPr>
       <w:tblGrid>
         <w:gridCol w:w="3968"/>
@@ -4657,7 +4657,6 @@
     </w:p>
     <w:tbl>
       <w:tblPr>
-        <w:tblW w:type="auto" w:w="0"/>
         <w:jc w:val="center"/>
         <w:tblLook w:firstColumn="1" w:firstRow="1" w:lastColumn="0" w:lastRow="0" w:noHBand="0" w:noVBand="1" w:val="04A0"/>
         <w:tblBorders>
@@ -4668,6 +4667,7 @@
           <w:insideH w:val="single" w:sz="4" w:space="0" w:color="000000"/>
           <w:insideV w:val="single" w:sz="4" w:space="0" w:color="000000"/>
         </w:tblBorders>
+        <w:tblW w:type="pct" w:w="5000"/>
       </w:tblPr>
       <w:tblGrid>
         <w:gridCol w:w="2646"/>
@@ -5128,7 +5128,6 @@
     </w:p>
     <w:tbl>
       <w:tblPr>
-        <w:tblW w:type="auto" w:w="0"/>
         <w:jc w:val="center"/>
         <w:tblLook w:firstColumn="1" w:firstRow="1" w:lastColumn="0" w:lastRow="0" w:noHBand="0" w:noVBand="1" w:val="04A0"/>
         <w:tblBorders>
@@ -5139,6 +5138,7 @@
           <w:insideH w:val="single" w:sz="4" w:space="0" w:color="000000"/>
           <w:insideV w:val="single" w:sz="4" w:space="0" w:color="000000"/>
         </w:tblBorders>
+        <w:tblW w:type="pct" w:w="5000"/>
       </w:tblPr>
       <w:tblGrid>
         <w:gridCol w:w="2646"/>
@@ -5909,7 +5909,6 @@
     </w:p>
     <w:tbl>
       <w:tblPr>
-        <w:tblW w:type="auto" w:w="0"/>
         <w:jc w:val="center"/>
         <w:tblLook w:firstColumn="1" w:firstRow="1" w:lastColumn="0" w:lastRow="0" w:noHBand="0" w:noVBand="1" w:val="04A0"/>
         <w:tblBorders>
@@ -5920,6 +5919,7 @@
           <w:insideH w:val="single" w:sz="4" w:space="0" w:color="000000"/>
           <w:insideV w:val="single" w:sz="4" w:space="0" w:color="000000"/>
         </w:tblBorders>
+        <w:tblW w:type="pct" w:w="5000"/>
       </w:tblPr>
       <w:tblGrid>
         <w:gridCol w:w="2646"/>
@@ -6680,7 +6680,6 @@
     </w:p>
     <w:tbl>
       <w:tblPr>
-        <w:tblW w:type="auto" w:w="0"/>
         <w:jc w:val="center"/>
         <w:tblLook w:firstColumn="1" w:firstRow="1" w:lastColumn="0" w:lastRow="0" w:noHBand="0" w:noVBand="1" w:val="04A0"/>
         <w:tblBorders>
@@ -6691,6 +6690,7 @@
           <w:insideH w:val="single" w:sz="4" w:space="0" w:color="000000"/>
           <w:insideV w:val="single" w:sz="4" w:space="0" w:color="000000"/>
         </w:tblBorders>
+        <w:tblW w:type="pct" w:w="5000"/>
       </w:tblPr>
       <w:tblGrid>
         <w:gridCol w:w="1984"/>
@@ -8237,7 +8237,6 @@
     </w:p>
     <w:tbl>
       <w:tblPr>
-        <w:tblW w:type="auto" w:w="0"/>
         <w:jc w:val="center"/>
         <w:tblLook w:firstColumn="1" w:firstRow="1" w:lastColumn="0" w:lastRow="0" w:noHBand="0" w:noVBand="1" w:val="04A0"/>
         <w:tblBorders>
@@ -8248,6 +8247,7 @@
           <w:insideH w:val="single" w:sz="4" w:space="0" w:color="000000"/>
           <w:insideV w:val="single" w:sz="4" w:space="0" w:color="000000"/>
         </w:tblBorders>
+        <w:tblW w:type="pct" w:w="5000"/>
       </w:tblPr>
       <w:tblGrid>
         <w:gridCol w:w="2646"/>
@@ -8940,145 +8940,9 @@
         </w:tc>
       </w:tr>
     </w:tbl>
-    <w:p>
-      <w:pPr>
-        <w:spacing w:before="120"/>
-        <w:jc w:val="center"/>
-      </w:pPr>
-      <w:r>
-        <w:drawing>
-          <wp:inline xmlns:a="http://schemas.openxmlformats.org/drawingml/2006/main" xmlns:pic="http://schemas.openxmlformats.org/drawingml/2006/picture">
-            <wp:extent cx="3960000" cy="2828571"/>
-            <wp:docPr id="17" name="Picture 17"/>
-            <wp:cNvGraphicFramePr>
-              <a:graphicFrameLocks noChangeAspect="1"/>
-            </wp:cNvGraphicFramePr>
-            <a:graphic>
-              <a:graphicData uri="http://schemas.openxmlformats.org/drawingml/2006/picture">
-                <pic:pic>
-                  <pic:nvPicPr>
-                    <pic:cNvPr id="0" name="km_scatter.png"/>
-                    <pic:cNvPicPr/>
-                  </pic:nvPicPr>
-                  <pic:blipFill>
-                    <a:blip r:embed="rId28"/>
-                    <a:stretch>
-                      <a:fillRect/>
-                    </a:stretch>
-                  </pic:blipFill>
-                  <pic:spPr>
-                    <a:xfrm>
-                      <a:off x="0" y="0"/>
-                      <a:ext cx="3960000" cy="2828571"/>
-                    </a:xfrm>
-                    <a:prstGeom prst="rect"/>
-                  </pic:spPr>
-                </pic:pic>
-              </a:graphicData>
-            </a:graphic>
-          </wp:inline>
-        </w:drawing>
-      </w:r>
-    </w:p>
-    <w:p>
-      <w:pPr>
-        <w:spacing w:line="240" w:lineRule="auto" w:after="120"/>
-        <w:jc w:val="center"/>
-      </w:pPr>
-      <w:r>
-        <w:rPr>
-          <w:rFonts w:ascii="Times New Roman" w:hAnsi="Times New Roman"/>
-          <w:b/>
-          <w:sz w:val="20"/>
-        </w:rPr>
-        <w:t>Gambar 4.1</w:t>
-      </w:r>
-      <w:r>
-        <w:rPr>
-          <w:rFonts w:ascii="Times New Roman" w:hAnsi="Times New Roman"/>
-          <w:b w:val="0"/>
-          <w:sz w:val="20"/>
-        </w:rPr>
-        <w:t xml:space="preserve"> Sebaran 10 Pelanggan</w:t>
-      </w:r>
-      <w:r>
-        <w:rPr>
-          <w:rFonts w:ascii="Times New Roman" w:hAnsi="Times New Roman"/>
-          <w:color w:val="FFFFFF"/>
-          <w:sz w:val="2"/>
-        </w:rPr>
-        <w:t xml:space="preserve"> ZF046</w:t>
-      </w:r>
-    </w:p>
-    <w:p>
-      <w:pPr>
-        <w:pStyle w:val="Heading3"/>
-        <w:tabs>
-          <w:tab w:pos="567" w:val="left"/>
-        </w:tabs>
-        <w:ind w:left="0"/>
-      </w:pPr>
-      <w:r>
-        <w:rPr>
-          <w:rFonts w:ascii="Times New Roman" w:hAnsi="Times New Roman" w:cs="Times New Roman" w:eastAsia="Times New Roman"/>
-        </w:rPr>
-        <w:t>4.2.1</w:t>
-        <w:tab/>
-        <w:t>Perhitungan Manual K=2</w:t>
-      </w:r>
-      <w:r>
-        <w:rPr>
-          <w:rFonts w:ascii="Times New Roman" w:hAnsi="Times New Roman"/>
-          <w:color w:val="FFFFFF"/>
-          <w:sz w:val="2"/>
-        </w:rPr>
-        <w:t xml:space="preserve"> ZT047</w:t>
-      </w:r>
-    </w:p>
-    <w:p>
-      <w:pPr>
-        <w:spacing w:line="360" w:lineRule="auto"/>
-        <w:ind w:firstLine="567"/>
-        <w:jc w:val="both"/>
-      </w:pPr>
-      <w:r>
-        <w:t>Untuk K=2, dipilih centroid awal C1 = P1 = (41, 19) dan C2 = P2 = (47, 100). Setiap data dihitung jaraknya terhadap kedua centroid, lalu ditetapkan ke klaster dengan centroid terdekat. Hasil perhitungan jarak iterasi pertama ditampilkan pada Tabel 4.7.</w:t>
-      </w:r>
-    </w:p>
     <w:p/>
-    <w:p>
-      <w:pPr>
-        <w:spacing w:line="240" w:lineRule="auto" w:after="120"/>
-        <w:jc w:val="left"/>
-      </w:pPr>
-      <w:r>
-        <w:rPr>
-          <w:rFonts w:ascii="Times New Roman" w:hAnsi="Times New Roman"/>
-          <w:b/>
-          <w:sz w:val="20"/>
-        </w:rPr>
-        <w:t>Tabel 4.7</w:t>
-      </w:r>
-      <w:r>
-        <w:rPr>
-          <w:rFonts w:ascii="Times New Roman" w:hAnsi="Times New Roman"/>
-          <w:b w:val="0"/>
-          <w:sz w:val="20"/>
-        </w:rPr>
-        <w:t xml:space="preserve"> Jarak Iterasi Pertama K-Means (K=2)</w:t>
-      </w:r>
-      <w:r>
-        <w:rPr>
-          <w:rFonts w:ascii="Times New Roman" w:hAnsi="Times New Roman"/>
-          <w:color w:val="FFFFFF"/>
-          <w:sz w:val="2"/>
-        </w:rPr>
-        <w:t xml:space="preserve"> ZT048</w:t>
-      </w:r>
-    </w:p>
     <w:tbl>
       <w:tblPr>
-        <w:tblW w:type="auto" w:w="0"/>
         <w:jc w:val="center"/>
         <w:tblLook w:firstColumn="1" w:firstRow="1" w:lastColumn="0" w:lastRow="0" w:noHBand="0" w:noVBand="1" w:val="04A0"/>
         <w:tblBorders>
@@ -9089,6 +8953,174 @@
           <w:insideH w:val="single" w:sz="4" w:space="0" w:color="000000"/>
           <w:insideV w:val="single" w:sz="4" w:space="0" w:color="000000"/>
         </w:tblBorders>
+        <w:tblW w:type="pct" w:w="5000"/>
+        <w:tblCellMar>
+          <w:top w:w="40" w:type="dxa"/>
+          <w:bottom w:w="40" w:type="dxa"/>
+          <w:left w:w="40" w:type="dxa"/>
+          <w:right w:w="40" w:type="dxa"/>
+        </w:tblCellMar>
+      </w:tblPr>
+      <w:tblGrid>
+        <w:gridCol w:w="7937"/>
+      </w:tblGrid>
+      <w:tr>
+        <w:tc>
+          <w:tcPr>
+            <w:tcW w:type="dxa" w:w="7937"/>
+          </w:tcPr>
+          <w:p>
+            <w:pPr>
+              <w:spacing w:before="0" w:after="0"/>
+              <w:jc w:val="center"/>
+            </w:pPr>
+            <w:r>
+              <w:drawing>
+                <wp:inline xmlns:a="http://schemas.openxmlformats.org/drawingml/2006/main" xmlns:pic="http://schemas.openxmlformats.org/drawingml/2006/picture">
+                  <wp:extent cx="3960000" cy="2828571"/>
+                  <wp:docPr id="17" name="Picture 17"/>
+                  <wp:cNvGraphicFramePr>
+                    <a:graphicFrameLocks noChangeAspect="1"/>
+                  </wp:cNvGraphicFramePr>
+                  <a:graphic>
+                    <a:graphicData uri="http://schemas.openxmlformats.org/drawingml/2006/picture">
+                      <pic:pic>
+                        <pic:nvPicPr>
+                          <pic:cNvPr id="0" name="km_scatter.png"/>
+                          <pic:cNvPicPr/>
+                        </pic:nvPicPr>
+                        <pic:blipFill>
+                          <a:blip r:embed="rId28"/>
+                          <a:stretch>
+                            <a:fillRect/>
+                          </a:stretch>
+                        </pic:blipFill>
+                        <pic:spPr>
+                          <a:xfrm>
+                            <a:off x="0" y="0"/>
+                            <a:ext cx="3960000" cy="2828571"/>
+                          </a:xfrm>
+                          <a:prstGeom prst="rect"/>
+                        </pic:spPr>
+                      </pic:pic>
+                    </a:graphicData>
+                  </a:graphic>
+                </wp:inline>
+              </w:drawing>
+            </w:r>
+          </w:p>
+        </w:tc>
+      </w:tr>
+    </w:tbl>
+    <w:p>
+      <w:pPr>
+        <w:spacing w:line="240" w:lineRule="auto" w:after="120"/>
+        <w:jc w:val="center"/>
+      </w:pPr>
+      <w:r>
+        <w:rPr>
+          <w:rFonts w:ascii="Times New Roman" w:hAnsi="Times New Roman"/>
+          <w:b/>
+          <w:sz w:val="20"/>
+        </w:rPr>
+        <w:t>Gambar 4.1</w:t>
+      </w:r>
+      <w:r>
+        <w:rPr>
+          <w:rFonts w:ascii="Times New Roman" w:hAnsi="Times New Roman"/>
+          <w:b w:val="0"/>
+          <w:sz w:val="20"/>
+        </w:rPr>
+        <w:t xml:space="preserve"> Sebaran 10 Pelanggan</w:t>
+      </w:r>
+      <w:r>
+        <w:rPr>
+          <w:rFonts w:ascii="Times New Roman" w:hAnsi="Times New Roman"/>
+          <w:color w:val="FFFFFF"/>
+          <w:sz w:val="2"/>
+        </w:rPr>
+        <w:t xml:space="preserve"> ZF046</w:t>
+      </w:r>
+    </w:p>
+    <w:p>
+      <w:pPr>
+        <w:pStyle w:val="Heading3"/>
+        <w:tabs>
+          <w:tab w:pos="567" w:val="left"/>
+        </w:tabs>
+        <w:ind w:left="0"/>
+      </w:pPr>
+      <w:r>
+        <w:rPr>
+          <w:rFonts w:ascii="Times New Roman" w:hAnsi="Times New Roman" w:cs="Times New Roman" w:eastAsia="Times New Roman"/>
+        </w:rPr>
+        <w:t>4.2.1</w:t>
+        <w:tab/>
+        <w:t>Perhitungan Manual K=2</w:t>
+      </w:r>
+      <w:r>
+        <w:rPr>
+          <w:rFonts w:ascii="Times New Roman" w:hAnsi="Times New Roman"/>
+          <w:color w:val="FFFFFF"/>
+          <w:sz w:val="2"/>
+        </w:rPr>
+        <w:t xml:space="preserve"> ZT047</w:t>
+      </w:r>
+    </w:p>
+    <w:p>
+      <w:pPr>
+        <w:spacing w:line="360" w:lineRule="auto"/>
+        <w:ind w:firstLine="567"/>
+        <w:jc w:val="both"/>
+      </w:pPr>
+      <w:r>
+        <w:t>Untuk K=2, dipilih centroid awal C1 = P1 = (41, 19) dan C2 = P2 = (47, 100). Setiap data dihitung jaraknya terhadap kedua centroid, lalu ditetapkan ke klaster dengan centroid terdekat. Hasil perhitungan jarak iterasi pertama ditampilkan pada Tabel 4.7.</w:t>
+      </w:r>
+    </w:p>
+    <w:p/>
+    <w:p>
+      <w:pPr>
+        <w:spacing w:line="240" w:lineRule="auto" w:after="120"/>
+        <w:jc w:val="left"/>
+      </w:pPr>
+      <w:r>
+        <w:rPr>
+          <w:rFonts w:ascii="Times New Roman" w:hAnsi="Times New Roman"/>
+          <w:b/>
+          <w:sz w:val="20"/>
+        </w:rPr>
+        <w:t>Tabel 4.7</w:t>
+      </w:r>
+      <w:r>
+        <w:rPr>
+          <w:rFonts w:ascii="Times New Roman" w:hAnsi="Times New Roman"/>
+          <w:b w:val="0"/>
+          <w:sz w:val="20"/>
+        </w:rPr>
+        <w:t xml:space="preserve"> Jarak Iterasi Pertama K-Means (K=2)</w:t>
+      </w:r>
+      <w:r>
+        <w:rPr>
+          <w:rFonts w:ascii="Times New Roman" w:hAnsi="Times New Roman"/>
+          <w:color w:val="FFFFFF"/>
+          <w:sz w:val="2"/>
+        </w:rPr>
+        <w:t xml:space="preserve"> ZT048</w:t>
+      </w:r>
+    </w:p>
+    <w:tbl>
+      <w:tblPr>
+        <w:jc w:val="center"/>
+        <w:tblLook w:firstColumn="1" w:firstRow="1" w:lastColumn="0" w:lastRow="0" w:noHBand="0" w:noVBand="1" w:val="04A0"/>
+        <w:tblBorders>
+          <w:top w:val="single" w:sz="4" w:space="0" w:color="000000"/>
+          <w:left w:val="single" w:sz="4" w:space="0" w:color="000000"/>
+          <w:bottom w:val="single" w:sz="4" w:space="0" w:color="000000"/>
+          <w:right w:val="single" w:sz="4" w:space="0" w:color="000000"/>
+          <w:insideH w:val="single" w:sz="4" w:space="0" w:color="000000"/>
+          <w:insideV w:val="single" w:sz="4" w:space="0" w:color="000000"/>
+        </w:tblBorders>
+        <w:tblW w:type="pct" w:w="5000"/>
       </w:tblPr>
       <w:tblGrid>
         <w:gridCol w:w="1323"/>
@@ -10490,7 +10522,6 @@
     </w:p>
     <w:tbl>
       <w:tblPr>
-        <w:tblW w:type="auto" w:w="0"/>
         <w:jc w:val="center"/>
         <w:tblLook w:firstColumn="1" w:firstRow="1" w:lastColumn="0" w:lastRow="0" w:noHBand="0" w:noVBand="1" w:val="04A0"/>
         <w:tblBorders>
@@ -10501,6 +10532,7 @@
           <w:insideH w:val="single" w:sz="4" w:space="0" w:color="000000"/>
           <w:insideV w:val="single" w:sz="4" w:space="0" w:color="000000"/>
         </w:tblBorders>
+        <w:tblW w:type="pct" w:w="5000"/>
       </w:tblPr>
       <w:tblGrid>
         <w:gridCol w:w="1984"/>
@@ -10933,145 +10965,9 @@
         <w:t>Algoritma konvergen setelah 4 iterasi dengan centroid final C1 = (35.57, 44.86) dan C2 = (47.00, 156.00). Visualisasi hasil ditampilkan pada Gambar 4.2.</w:t>
       </w:r>
     </w:p>
-    <w:p>
-      <w:pPr>
-        <w:spacing w:before="120"/>
-        <w:jc w:val="center"/>
-      </w:pPr>
-      <w:r>
-        <w:drawing>
-          <wp:inline xmlns:a="http://schemas.openxmlformats.org/drawingml/2006/main" xmlns:pic="http://schemas.openxmlformats.org/drawingml/2006/picture">
-            <wp:extent cx="3960000" cy="2828571"/>
-            <wp:docPr id="18" name="Picture 18"/>
-            <wp:cNvGraphicFramePr>
-              <a:graphicFrameLocks noChangeAspect="1"/>
-            </wp:cNvGraphicFramePr>
-            <a:graphic>
-              <a:graphicData uri="http://schemas.openxmlformats.org/drawingml/2006/picture">
-                <pic:pic>
-                  <pic:nvPicPr>
-                    <pic:cNvPr id="0" name="km_k2.png"/>
-                    <pic:cNvPicPr/>
-                  </pic:nvPicPr>
-                  <pic:blipFill>
-                    <a:blip r:embed="rId29"/>
-                    <a:stretch>
-                      <a:fillRect/>
-                    </a:stretch>
-                  </pic:blipFill>
-                  <pic:spPr>
-                    <a:xfrm>
-                      <a:off x="0" y="0"/>
-                      <a:ext cx="3960000" cy="2828571"/>
-                    </a:xfrm>
-                    <a:prstGeom prst="rect"/>
-                  </pic:spPr>
-                </pic:pic>
-              </a:graphicData>
-            </a:graphic>
-          </wp:inline>
-        </w:drawing>
-      </w:r>
-    </w:p>
-    <w:p>
-      <w:pPr>
-        <w:spacing w:line="240" w:lineRule="auto" w:after="120"/>
-        <w:jc w:val="center"/>
-      </w:pPr>
-      <w:r>
-        <w:rPr>
-          <w:rFonts w:ascii="Times New Roman" w:hAnsi="Times New Roman"/>
-          <w:b/>
-          <w:sz w:val="20"/>
-        </w:rPr>
-        <w:t>Gambar 4.2</w:t>
-      </w:r>
-      <w:r>
-        <w:rPr>
-          <w:rFonts w:ascii="Times New Roman" w:hAnsi="Times New Roman"/>
-          <w:b w:val="0"/>
-          <w:sz w:val="20"/>
-        </w:rPr>
-        <w:t xml:space="preserve"> Hasil K-Means Manual untuk K=2</w:t>
-      </w:r>
-      <w:r>
-        <w:rPr>
-          <w:rFonts w:ascii="Times New Roman" w:hAnsi="Times New Roman"/>
-          <w:color w:val="FFFFFF"/>
-          <w:sz w:val="2"/>
-        </w:rPr>
-        <w:t xml:space="preserve"> ZF050</w:t>
-      </w:r>
-    </w:p>
-    <w:p>
-      <w:pPr>
-        <w:pStyle w:val="Heading3"/>
-        <w:tabs>
-          <w:tab w:pos="567" w:val="left"/>
-        </w:tabs>
-        <w:ind w:left="0"/>
-      </w:pPr>
-      <w:r>
-        <w:rPr>
-          <w:rFonts w:ascii="Times New Roman" w:hAnsi="Times New Roman" w:cs="Times New Roman" w:eastAsia="Times New Roman"/>
-        </w:rPr>
-        <w:t>4.2.2</w:t>
-        <w:tab/>
-        <w:t>Penentuan K Optimal dengan Elbow Method</w:t>
-      </w:r>
-      <w:r>
-        <w:rPr>
-          <w:rFonts w:ascii="Times New Roman" w:hAnsi="Times New Roman"/>
-          <w:color w:val="FFFFFF"/>
-          <w:sz w:val="2"/>
-        </w:rPr>
-        <w:t xml:space="preserve"> ZT051</w:t>
-      </w:r>
-    </w:p>
-    <w:p>
-      <w:pPr>
-        <w:spacing w:line="360" w:lineRule="auto"/>
-        <w:ind w:firstLine="567"/>
-        <w:jc w:val="both"/>
-      </w:pPr>
-      <w:r>
-        <w:t>Untuk menentukan nilai K yang paling sesuai, dihitung SSE untuk K=1 hingga K=7 pada data yang telah distandarisasi (Z-Score) seperti pada Tabel 4.9. Kurva SSE diplot pada Gambar 4.3.</w:t>
-      </w:r>
-    </w:p>
     <w:p/>
-    <w:p>
-      <w:pPr>
-        <w:spacing w:line="240" w:lineRule="auto" w:after="120"/>
-        <w:jc w:val="left"/>
-      </w:pPr>
-      <w:r>
-        <w:rPr>
-          <w:rFonts w:ascii="Times New Roman" w:hAnsi="Times New Roman"/>
-          <w:b/>
-          <w:sz w:val="20"/>
-        </w:rPr>
-        <w:t>Tabel 4.9</w:t>
-      </w:r>
-      <w:r>
-        <w:rPr>
-          <w:rFonts w:ascii="Times New Roman" w:hAnsi="Times New Roman"/>
-          <w:b w:val="0"/>
-          <w:sz w:val="20"/>
-        </w:rPr>
-        <w:t xml:space="preserve"> Nilai SSE per K (Elbow Method)</w:t>
-      </w:r>
-      <w:r>
-        <w:rPr>
-          <w:rFonts w:ascii="Times New Roman" w:hAnsi="Times New Roman"/>
-          <w:color w:val="FFFFFF"/>
-          <w:sz w:val="2"/>
-        </w:rPr>
-        <w:t xml:space="preserve"> ZT052</w:t>
-      </w:r>
-    </w:p>
     <w:tbl>
       <w:tblPr>
-        <w:tblW w:type="auto" w:w="0"/>
         <w:jc w:val="center"/>
         <w:tblLook w:firstColumn="1" w:firstRow="1" w:lastColumn="0" w:lastRow="0" w:noHBand="0" w:noVBand="1" w:val="04A0"/>
         <w:tblBorders>
@@ -11082,6 +10978,174 @@
           <w:insideH w:val="single" w:sz="4" w:space="0" w:color="000000"/>
           <w:insideV w:val="single" w:sz="4" w:space="0" w:color="000000"/>
         </w:tblBorders>
+        <w:tblW w:type="pct" w:w="5000"/>
+        <w:tblCellMar>
+          <w:top w:w="40" w:type="dxa"/>
+          <w:bottom w:w="40" w:type="dxa"/>
+          <w:left w:w="40" w:type="dxa"/>
+          <w:right w:w="40" w:type="dxa"/>
+        </w:tblCellMar>
+      </w:tblPr>
+      <w:tblGrid>
+        <w:gridCol w:w="7937"/>
+      </w:tblGrid>
+      <w:tr>
+        <w:tc>
+          <w:tcPr>
+            <w:tcW w:type="dxa" w:w="7937"/>
+          </w:tcPr>
+          <w:p>
+            <w:pPr>
+              <w:spacing w:before="0" w:after="0"/>
+              <w:jc w:val="center"/>
+            </w:pPr>
+            <w:r>
+              <w:drawing>
+                <wp:inline xmlns:a="http://schemas.openxmlformats.org/drawingml/2006/main" xmlns:pic="http://schemas.openxmlformats.org/drawingml/2006/picture">
+                  <wp:extent cx="3960000" cy="2828571"/>
+                  <wp:docPr id="18" name="Picture 18"/>
+                  <wp:cNvGraphicFramePr>
+                    <a:graphicFrameLocks noChangeAspect="1"/>
+                  </wp:cNvGraphicFramePr>
+                  <a:graphic>
+                    <a:graphicData uri="http://schemas.openxmlformats.org/drawingml/2006/picture">
+                      <pic:pic>
+                        <pic:nvPicPr>
+                          <pic:cNvPr id="0" name="km_k2.png"/>
+                          <pic:cNvPicPr/>
+                        </pic:nvPicPr>
+                        <pic:blipFill>
+                          <a:blip r:embed="rId29"/>
+                          <a:stretch>
+                            <a:fillRect/>
+                          </a:stretch>
+                        </pic:blipFill>
+                        <pic:spPr>
+                          <a:xfrm>
+                            <a:off x="0" y="0"/>
+                            <a:ext cx="3960000" cy="2828571"/>
+                          </a:xfrm>
+                          <a:prstGeom prst="rect"/>
+                        </pic:spPr>
+                      </pic:pic>
+                    </a:graphicData>
+                  </a:graphic>
+                </wp:inline>
+              </w:drawing>
+            </w:r>
+          </w:p>
+        </w:tc>
+      </w:tr>
+    </w:tbl>
+    <w:p>
+      <w:pPr>
+        <w:spacing w:line="240" w:lineRule="auto" w:after="120"/>
+        <w:jc w:val="center"/>
+      </w:pPr>
+      <w:r>
+        <w:rPr>
+          <w:rFonts w:ascii="Times New Roman" w:hAnsi="Times New Roman"/>
+          <w:b/>
+          <w:sz w:val="20"/>
+        </w:rPr>
+        <w:t>Gambar 4.2</w:t>
+      </w:r>
+      <w:r>
+        <w:rPr>
+          <w:rFonts w:ascii="Times New Roman" w:hAnsi="Times New Roman"/>
+          <w:b w:val="0"/>
+          <w:sz w:val="20"/>
+        </w:rPr>
+        <w:t xml:space="preserve"> Hasil K-Means Manual untuk K=2</w:t>
+      </w:r>
+      <w:r>
+        <w:rPr>
+          <w:rFonts w:ascii="Times New Roman" w:hAnsi="Times New Roman"/>
+          <w:color w:val="FFFFFF"/>
+          <w:sz w:val="2"/>
+        </w:rPr>
+        <w:t xml:space="preserve"> ZF050</w:t>
+      </w:r>
+    </w:p>
+    <w:p>
+      <w:pPr>
+        <w:pStyle w:val="Heading3"/>
+        <w:tabs>
+          <w:tab w:pos="567" w:val="left"/>
+        </w:tabs>
+        <w:ind w:left="0"/>
+      </w:pPr>
+      <w:r>
+        <w:rPr>
+          <w:rFonts w:ascii="Times New Roman" w:hAnsi="Times New Roman" w:cs="Times New Roman" w:eastAsia="Times New Roman"/>
+        </w:rPr>
+        <w:t>4.2.2</w:t>
+        <w:tab/>
+        <w:t>Penentuan K Optimal dengan Elbow Method</w:t>
+      </w:r>
+      <w:r>
+        <w:rPr>
+          <w:rFonts w:ascii="Times New Roman" w:hAnsi="Times New Roman"/>
+          <w:color w:val="FFFFFF"/>
+          <w:sz w:val="2"/>
+        </w:rPr>
+        <w:t xml:space="preserve"> ZT051</w:t>
+      </w:r>
+    </w:p>
+    <w:p>
+      <w:pPr>
+        <w:spacing w:line="360" w:lineRule="auto"/>
+        <w:ind w:firstLine="567"/>
+        <w:jc w:val="both"/>
+      </w:pPr>
+      <w:r>
+        <w:t>Untuk menentukan nilai K yang paling sesuai, dihitung SSE untuk K=1 hingga K=7 pada data yang telah distandarisasi (Z-Score) seperti pada Tabel 4.9. Kurva SSE diplot pada Gambar 4.3.</w:t>
+      </w:r>
+    </w:p>
+    <w:p/>
+    <w:p>
+      <w:pPr>
+        <w:spacing w:line="240" w:lineRule="auto" w:after="120"/>
+        <w:jc w:val="left"/>
+      </w:pPr>
+      <w:r>
+        <w:rPr>
+          <w:rFonts w:ascii="Times New Roman" w:hAnsi="Times New Roman"/>
+          <w:b/>
+          <w:sz w:val="20"/>
+        </w:rPr>
+        <w:t>Tabel 4.9</w:t>
+      </w:r>
+      <w:r>
+        <w:rPr>
+          <w:rFonts w:ascii="Times New Roman" w:hAnsi="Times New Roman"/>
+          <w:b w:val="0"/>
+          <w:sz w:val="20"/>
+        </w:rPr>
+        <w:t xml:space="preserve"> Nilai SSE per K (Elbow Method)</w:t>
+      </w:r>
+      <w:r>
+        <w:rPr>
+          <w:rFonts w:ascii="Times New Roman" w:hAnsi="Times New Roman"/>
+          <w:color w:val="FFFFFF"/>
+          <w:sz w:val="2"/>
+        </w:rPr>
+        <w:t xml:space="preserve"> ZT052</w:t>
+      </w:r>
+    </w:p>
+    <w:tbl>
+      <w:tblPr>
+        <w:jc w:val="center"/>
+        <w:tblLook w:firstColumn="1" w:firstRow="1" w:lastColumn="0" w:lastRow="0" w:noHBand="0" w:noVBand="1" w:val="04A0"/>
+        <w:tblBorders>
+          <w:top w:val="single" w:sz="4" w:space="0" w:color="000000"/>
+          <w:left w:val="single" w:sz="4" w:space="0" w:color="000000"/>
+          <w:bottom w:val="single" w:sz="4" w:space="0" w:color="000000"/>
+          <w:right w:val="single" w:sz="4" w:space="0" w:color="000000"/>
+          <w:insideH w:val="single" w:sz="4" w:space="0" w:color="000000"/>
+          <w:insideV w:val="single" w:sz="4" w:space="0" w:color="000000"/>
+        </w:tblBorders>
+        <w:tblW w:type="pct" w:w="5000"/>
       </w:tblPr>
       <w:tblGrid>
         <w:gridCol w:w="3968"/>
@@ -11426,46 +11490,78 @@
         </w:tc>
       </w:tr>
     </w:tbl>
-    <w:p>
-      <w:pPr>
-        <w:spacing w:before="120"/>
+    <w:p/>
+    <w:tbl>
+      <w:tblPr>
         <w:jc w:val="center"/>
-      </w:pPr>
-      <w:r>
-        <w:drawing>
-          <wp:inline xmlns:a="http://schemas.openxmlformats.org/drawingml/2006/main" xmlns:pic="http://schemas.openxmlformats.org/drawingml/2006/picture">
-            <wp:extent cx="4320000" cy="2700000"/>
-            <wp:docPr id="19" name="Picture 19"/>
-            <wp:cNvGraphicFramePr>
-              <a:graphicFrameLocks noChangeAspect="1"/>
-            </wp:cNvGraphicFramePr>
-            <a:graphic>
-              <a:graphicData uri="http://schemas.openxmlformats.org/drawingml/2006/picture">
-                <pic:pic>
-                  <pic:nvPicPr>
-                    <pic:cNvPr id="0" name="km_elbow.png"/>
-                    <pic:cNvPicPr/>
-                  </pic:nvPicPr>
-                  <pic:blipFill>
-                    <a:blip r:embed="rId30"/>
-                    <a:stretch>
-                      <a:fillRect/>
-                    </a:stretch>
-                  </pic:blipFill>
-                  <pic:spPr>
-                    <a:xfrm>
-                      <a:off x="0" y="0"/>
-                      <a:ext cx="4320000" cy="2700000"/>
-                    </a:xfrm>
-                    <a:prstGeom prst="rect"/>
-                  </pic:spPr>
-                </pic:pic>
-              </a:graphicData>
-            </a:graphic>
-          </wp:inline>
-        </w:drawing>
-      </w:r>
-    </w:p>
+        <w:tblLook w:firstColumn="1" w:firstRow="1" w:lastColumn="0" w:lastRow="0" w:noHBand="0" w:noVBand="1" w:val="04A0"/>
+        <w:tblBorders>
+          <w:top w:val="single" w:sz="4" w:space="0" w:color="000000"/>
+          <w:left w:val="single" w:sz="4" w:space="0" w:color="000000"/>
+          <w:bottom w:val="single" w:sz="4" w:space="0" w:color="000000"/>
+          <w:right w:val="single" w:sz="4" w:space="0" w:color="000000"/>
+          <w:insideH w:val="single" w:sz="4" w:space="0" w:color="000000"/>
+          <w:insideV w:val="single" w:sz="4" w:space="0" w:color="000000"/>
+        </w:tblBorders>
+        <w:tblW w:type="pct" w:w="5000"/>
+        <w:tblCellMar>
+          <w:top w:w="40" w:type="dxa"/>
+          <w:bottom w:w="40" w:type="dxa"/>
+          <w:left w:w="40" w:type="dxa"/>
+          <w:right w:w="40" w:type="dxa"/>
+        </w:tblCellMar>
+      </w:tblPr>
+      <w:tblGrid>
+        <w:gridCol w:w="7937"/>
+      </w:tblGrid>
+      <w:tr>
+        <w:tc>
+          <w:tcPr>
+            <w:tcW w:type="dxa" w:w="7937"/>
+          </w:tcPr>
+          <w:p>
+            <w:pPr>
+              <w:spacing w:before="0" w:after="0"/>
+              <w:jc w:val="center"/>
+            </w:pPr>
+            <w:r>
+              <w:drawing>
+                <wp:inline xmlns:a="http://schemas.openxmlformats.org/drawingml/2006/main" xmlns:pic="http://schemas.openxmlformats.org/drawingml/2006/picture">
+                  <wp:extent cx="4320000" cy="2700000"/>
+                  <wp:docPr id="19" name="Picture 19"/>
+                  <wp:cNvGraphicFramePr>
+                    <a:graphicFrameLocks noChangeAspect="1"/>
+                  </wp:cNvGraphicFramePr>
+                  <a:graphic>
+                    <a:graphicData uri="http://schemas.openxmlformats.org/drawingml/2006/picture">
+                      <pic:pic>
+                        <pic:nvPicPr>
+                          <pic:cNvPr id="0" name="km_elbow.png"/>
+                          <pic:cNvPicPr/>
+                        </pic:nvPicPr>
+                        <pic:blipFill>
+                          <a:blip r:embed="rId30"/>
+                          <a:stretch>
+                            <a:fillRect/>
+                          </a:stretch>
+                        </pic:blipFill>
+                        <pic:spPr>
+                          <a:xfrm>
+                            <a:off x="0" y="0"/>
+                            <a:ext cx="4320000" cy="2700000"/>
+                          </a:xfrm>
+                          <a:prstGeom prst="rect"/>
+                        </pic:spPr>
+                      </pic:pic>
+                    </a:graphicData>
+                  </a:graphic>
+                </wp:inline>
+              </w:drawing>
+            </w:r>
+          </w:p>
+        </w:tc>
+      </w:tr>
+    </w:tbl>
     <w:p>
       <w:pPr>
         <w:spacing w:line="240" w:lineRule="auto" w:after="120"/>
@@ -11506,46 +11602,78 @@
         <w:t>Dari Gambar 4.3 terlihat bahwa penurunan SSE paling tajam terjadi dari K=1 ke K=2, lalu mulai melandai pada K=3. Titik siku (elbow) berada di sekitar K=2 atau K=3, sehingga kedua nilai ini menjadi kandidat K optimal. Hasil clustering untuk K=3 hingga K=6 ditampilkan pada Gambar 4.4.</w:t>
       </w:r>
     </w:p>
-    <w:p>
-      <w:pPr>
-        <w:spacing w:before="120"/>
+    <w:p/>
+    <w:tbl>
+      <w:tblPr>
         <w:jc w:val="center"/>
-      </w:pPr>
-      <w:r>
-        <w:drawing>
-          <wp:inline xmlns:a="http://schemas.openxmlformats.org/drawingml/2006/main" xmlns:pic="http://schemas.openxmlformats.org/drawingml/2006/picture">
-            <wp:extent cx="4680000" cy="3510000"/>
-            <wp:docPr id="20" name="Picture 20"/>
-            <wp:cNvGraphicFramePr>
-              <a:graphicFrameLocks noChangeAspect="1"/>
-            </wp:cNvGraphicFramePr>
-            <a:graphic>
-              <a:graphicData uri="http://schemas.openxmlformats.org/drawingml/2006/picture">
-                <pic:pic>
-                  <pic:nvPicPr>
-                    <pic:cNvPr id="0" name="km_k36.png"/>
-                    <pic:cNvPicPr/>
-                  </pic:nvPicPr>
-                  <pic:blipFill>
-                    <a:blip r:embed="rId31"/>
-                    <a:stretch>
-                      <a:fillRect/>
-                    </a:stretch>
-                  </pic:blipFill>
-                  <pic:spPr>
-                    <a:xfrm>
-                      <a:off x="0" y="0"/>
-                      <a:ext cx="4680000" cy="3510000"/>
-                    </a:xfrm>
-                    <a:prstGeom prst="rect"/>
-                  </pic:spPr>
-                </pic:pic>
-              </a:graphicData>
-            </a:graphic>
-          </wp:inline>
-        </w:drawing>
-      </w:r>
-    </w:p>
+        <w:tblLook w:firstColumn="1" w:firstRow="1" w:lastColumn="0" w:lastRow="0" w:noHBand="0" w:noVBand="1" w:val="04A0"/>
+        <w:tblBorders>
+          <w:top w:val="single" w:sz="4" w:space="0" w:color="000000"/>
+          <w:left w:val="single" w:sz="4" w:space="0" w:color="000000"/>
+          <w:bottom w:val="single" w:sz="4" w:space="0" w:color="000000"/>
+          <w:right w:val="single" w:sz="4" w:space="0" w:color="000000"/>
+          <w:insideH w:val="single" w:sz="4" w:space="0" w:color="000000"/>
+          <w:insideV w:val="single" w:sz="4" w:space="0" w:color="000000"/>
+        </w:tblBorders>
+        <w:tblW w:type="pct" w:w="5000"/>
+        <w:tblCellMar>
+          <w:top w:w="40" w:type="dxa"/>
+          <w:bottom w:w="40" w:type="dxa"/>
+          <w:left w:w="40" w:type="dxa"/>
+          <w:right w:w="40" w:type="dxa"/>
+        </w:tblCellMar>
+      </w:tblPr>
+      <w:tblGrid>
+        <w:gridCol w:w="7937"/>
+      </w:tblGrid>
+      <w:tr>
+        <w:tc>
+          <w:tcPr>
+            <w:tcW w:type="dxa" w:w="7937"/>
+          </w:tcPr>
+          <w:p>
+            <w:pPr>
+              <w:spacing w:before="0" w:after="0"/>
+              <w:jc w:val="center"/>
+            </w:pPr>
+            <w:r>
+              <w:drawing>
+                <wp:inline xmlns:a="http://schemas.openxmlformats.org/drawingml/2006/main" xmlns:pic="http://schemas.openxmlformats.org/drawingml/2006/picture">
+                  <wp:extent cx="4680000" cy="3510000"/>
+                  <wp:docPr id="20" name="Picture 20"/>
+                  <wp:cNvGraphicFramePr>
+                    <a:graphicFrameLocks noChangeAspect="1"/>
+                  </wp:cNvGraphicFramePr>
+                  <a:graphic>
+                    <a:graphicData uri="http://schemas.openxmlformats.org/drawingml/2006/picture">
+                      <pic:pic>
+                        <pic:nvPicPr>
+                          <pic:cNvPr id="0" name="km_k36.png"/>
+                          <pic:cNvPicPr/>
+                        </pic:nvPicPr>
+                        <pic:blipFill>
+                          <a:blip r:embed="rId31"/>
+                          <a:stretch>
+                            <a:fillRect/>
+                          </a:stretch>
+                        </pic:blipFill>
+                        <pic:spPr>
+                          <a:xfrm>
+                            <a:off x="0" y="0"/>
+                            <a:ext cx="4680000" cy="3510000"/>
+                          </a:xfrm>
+                          <a:prstGeom prst="rect"/>
+                        </pic:spPr>
+                      </pic:pic>
+                    </a:graphicData>
+                  </a:graphic>
+                </wp:inline>
+              </w:drawing>
+            </w:r>
+          </w:p>
+        </w:tc>
+      </w:tr>
+    </w:tbl>
     <w:p>
       <w:pPr>
         <w:spacing w:line="240" w:lineRule="auto" w:after="120"/>
@@ -12137,7 +12265,6 @@
     </w:p>
     <w:tbl>
       <w:tblPr>
-        <w:tblW w:type="auto" w:w="0"/>
         <w:jc w:val="center"/>
         <w:tblLook w:firstColumn="1" w:firstRow="1" w:lastColumn="0" w:lastRow="0" w:noHBand="0" w:noVBand="1" w:val="04A0"/>
         <w:tblBorders>
@@ -12148,6 +12275,7 @@
           <w:insideH w:val="single" w:sz="4" w:space="0" w:color="000000"/>
           <w:insideV w:val="single" w:sz="4" w:space="0" w:color="000000"/>
         </w:tblBorders>
+        <w:tblW w:type="pct" w:w="5000"/>
       </w:tblPr>
       <w:tblGrid>
         <w:gridCol w:w="2646"/>
@@ -12840,145 +12968,9 @@
         </w:tc>
       </w:tr>
     </w:tbl>
-    <w:p>
-      <w:pPr>
-        <w:spacing w:before="120"/>
-        <w:jc w:val="center"/>
-      </w:pPr>
-      <w:r>
-        <w:drawing>
-          <wp:inline xmlns:a="http://schemas.openxmlformats.org/drawingml/2006/main" xmlns:pic="http://schemas.openxmlformats.org/drawingml/2006/picture">
-            <wp:extent cx="3960000" cy="3111429"/>
-            <wp:docPr id="21" name="Picture 21"/>
-            <wp:cNvGraphicFramePr>
-              <a:graphicFrameLocks noChangeAspect="1"/>
-            </wp:cNvGraphicFramePr>
-            <a:graphic>
-              <a:graphicData uri="http://schemas.openxmlformats.org/drawingml/2006/picture">
-                <pic:pic>
-                  <pic:nvPicPr>
-                    <pic:cNvPr id="0" name="ag_scatter.png"/>
-                    <pic:cNvPicPr/>
-                  </pic:nvPicPr>
-                  <pic:blipFill>
-                    <a:blip r:embed="rId32"/>
-                    <a:stretch>
-                      <a:fillRect/>
-                    </a:stretch>
-                  </pic:blipFill>
-                  <pic:spPr>
-                    <a:xfrm>
-                      <a:off x="0" y="0"/>
-                      <a:ext cx="3960000" cy="3111429"/>
-                    </a:xfrm>
-                    <a:prstGeom prst="rect"/>
-                  </pic:spPr>
-                </pic:pic>
-              </a:graphicData>
-            </a:graphic>
-          </wp:inline>
-        </w:drawing>
-      </w:r>
-    </w:p>
-    <w:p>
-      <w:pPr>
-        <w:spacing w:line="240" w:lineRule="auto" w:after="120"/>
-        <w:jc w:val="center"/>
-      </w:pPr>
-      <w:r>
-        <w:rPr>
-          <w:rFonts w:ascii="Times New Roman" w:hAnsi="Times New Roman"/>
-          <w:b/>
-          <w:sz w:val="20"/>
-        </w:rPr>
-        <w:t>Gambar 4.5</w:t>
-      </w:r>
-      <w:r>
-        <w:rPr>
-          <w:rFonts w:ascii="Times New Roman" w:hAnsi="Times New Roman"/>
-          <w:b w:val="0"/>
-          <w:sz w:val="20"/>
-        </w:rPr>
-        <w:t xml:space="preserve"> Sebaran 10 Mahasiswa</w:t>
-      </w:r>
-      <w:r>
-        <w:rPr>
-          <w:rFonts w:ascii="Times New Roman" w:hAnsi="Times New Roman"/>
-          <w:color w:val="FFFFFF"/>
-          <w:sz w:val="2"/>
-        </w:rPr>
-        <w:t xml:space="preserve"> ZF059</w:t>
-      </w:r>
-    </w:p>
-    <w:p>
-      <w:pPr>
-        <w:pStyle w:val="Heading3"/>
-        <w:tabs>
-          <w:tab w:pos="567" w:val="left"/>
-        </w:tabs>
-        <w:ind w:left="0"/>
-      </w:pPr>
-      <w:r>
-        <w:rPr>
-          <w:rFonts w:ascii="Times New Roman" w:hAnsi="Times New Roman" w:cs="Times New Roman" w:eastAsia="Times New Roman"/>
-        </w:rPr>
-        <w:t>4.3.1</w:t>
-        <w:tab/>
-        <w:t>Pembentukan Matriks Jarak Awal</w:t>
-      </w:r>
-      <w:r>
-        <w:rPr>
-          <w:rFonts w:ascii="Times New Roman" w:hAnsi="Times New Roman"/>
-          <w:color w:val="FFFFFF"/>
-          <w:sz w:val="2"/>
-        </w:rPr>
-        <w:t xml:space="preserve"> ZT060</w:t>
-      </w:r>
-    </w:p>
-    <w:p>
-      <w:pPr>
-        <w:spacing w:line="360" w:lineRule="auto"/>
-        <w:ind w:firstLine="567"/>
-        <w:jc w:val="both"/>
-      </w:pPr>
-      <w:r>
-        <w:t>Langkah pertama adalah menghitung jarak Euclidean antar seluruh pasangan data. Karena terdapat 10 data, matriks jarak berukuran 10 x 10 dan bersifat simetris dengan diagonal nol. Matriks jarak awal ditampilkan pada Tabel 4.11.</w:t>
-      </w:r>
-    </w:p>
     <w:p/>
-    <w:p>
-      <w:pPr>
-        <w:spacing w:line="240" w:lineRule="auto" w:after="120"/>
-        <w:jc w:val="left"/>
-      </w:pPr>
-      <w:r>
-        <w:rPr>
-          <w:rFonts w:ascii="Times New Roman" w:hAnsi="Times New Roman"/>
-          <w:b/>
-          <w:sz w:val="20"/>
-        </w:rPr>
-        <w:t>Tabel 4.11</w:t>
-      </w:r>
-      <w:r>
-        <w:rPr>
-          <w:rFonts w:ascii="Times New Roman" w:hAnsi="Times New Roman"/>
-          <w:b w:val="0"/>
-          <w:sz w:val="20"/>
-        </w:rPr>
-        <w:t xml:space="preserve"> Matriks Jarak Awal Antar Mahasiswa (Euclidean)</w:t>
-      </w:r>
-      <w:r>
-        <w:rPr>
-          <w:rFonts w:ascii="Times New Roman" w:hAnsi="Times New Roman"/>
-          <w:color w:val="FFFFFF"/>
-          <w:sz w:val="2"/>
-        </w:rPr>
-        <w:t xml:space="preserve"> ZT061</w:t>
-      </w:r>
-    </w:p>
     <w:tbl>
       <w:tblPr>
-        <w:tblW w:type="auto" w:w="0"/>
         <w:jc w:val="center"/>
         <w:tblLook w:firstColumn="1" w:firstRow="1" w:lastColumn="0" w:lastRow="0" w:noHBand="0" w:noVBand="1" w:val="04A0"/>
         <w:tblBorders>
@@ -12989,6 +12981,174 @@
           <w:insideH w:val="single" w:sz="4" w:space="0" w:color="000000"/>
           <w:insideV w:val="single" w:sz="4" w:space="0" w:color="000000"/>
         </w:tblBorders>
+        <w:tblW w:type="pct" w:w="5000"/>
+        <w:tblCellMar>
+          <w:top w:w="40" w:type="dxa"/>
+          <w:bottom w:w="40" w:type="dxa"/>
+          <w:left w:w="40" w:type="dxa"/>
+          <w:right w:w="40" w:type="dxa"/>
+        </w:tblCellMar>
+      </w:tblPr>
+      <w:tblGrid>
+        <w:gridCol w:w="7937"/>
+      </w:tblGrid>
+      <w:tr>
+        <w:tc>
+          <w:tcPr>
+            <w:tcW w:type="dxa" w:w="7937"/>
+          </w:tcPr>
+          <w:p>
+            <w:pPr>
+              <w:spacing w:before="0" w:after="0"/>
+              <w:jc w:val="center"/>
+            </w:pPr>
+            <w:r>
+              <w:drawing>
+                <wp:inline xmlns:a="http://schemas.openxmlformats.org/drawingml/2006/main" xmlns:pic="http://schemas.openxmlformats.org/drawingml/2006/picture">
+                  <wp:extent cx="3960000" cy="3111429"/>
+                  <wp:docPr id="21" name="Picture 21"/>
+                  <wp:cNvGraphicFramePr>
+                    <a:graphicFrameLocks noChangeAspect="1"/>
+                  </wp:cNvGraphicFramePr>
+                  <a:graphic>
+                    <a:graphicData uri="http://schemas.openxmlformats.org/drawingml/2006/picture">
+                      <pic:pic>
+                        <pic:nvPicPr>
+                          <pic:cNvPr id="0" name="ag_scatter.png"/>
+                          <pic:cNvPicPr/>
+                        </pic:nvPicPr>
+                        <pic:blipFill>
+                          <a:blip r:embed="rId32"/>
+                          <a:stretch>
+                            <a:fillRect/>
+                          </a:stretch>
+                        </pic:blipFill>
+                        <pic:spPr>
+                          <a:xfrm>
+                            <a:off x="0" y="0"/>
+                            <a:ext cx="3960000" cy="3111429"/>
+                          </a:xfrm>
+                          <a:prstGeom prst="rect"/>
+                        </pic:spPr>
+                      </pic:pic>
+                    </a:graphicData>
+                  </a:graphic>
+                </wp:inline>
+              </w:drawing>
+            </w:r>
+          </w:p>
+        </w:tc>
+      </w:tr>
+    </w:tbl>
+    <w:p>
+      <w:pPr>
+        <w:spacing w:line="240" w:lineRule="auto" w:after="120"/>
+        <w:jc w:val="center"/>
+      </w:pPr>
+      <w:r>
+        <w:rPr>
+          <w:rFonts w:ascii="Times New Roman" w:hAnsi="Times New Roman"/>
+          <w:b/>
+          <w:sz w:val="20"/>
+        </w:rPr>
+        <w:t>Gambar 4.5</w:t>
+      </w:r>
+      <w:r>
+        <w:rPr>
+          <w:rFonts w:ascii="Times New Roman" w:hAnsi="Times New Roman"/>
+          <w:b w:val="0"/>
+          <w:sz w:val="20"/>
+        </w:rPr>
+        <w:t xml:space="preserve"> Sebaran 10 Mahasiswa</w:t>
+      </w:r>
+      <w:r>
+        <w:rPr>
+          <w:rFonts w:ascii="Times New Roman" w:hAnsi="Times New Roman"/>
+          <w:color w:val="FFFFFF"/>
+          <w:sz w:val="2"/>
+        </w:rPr>
+        <w:t xml:space="preserve"> ZF059</w:t>
+      </w:r>
+    </w:p>
+    <w:p>
+      <w:pPr>
+        <w:pStyle w:val="Heading3"/>
+        <w:tabs>
+          <w:tab w:pos="567" w:val="left"/>
+        </w:tabs>
+        <w:ind w:left="0"/>
+      </w:pPr>
+      <w:r>
+        <w:rPr>
+          <w:rFonts w:ascii="Times New Roman" w:hAnsi="Times New Roman" w:cs="Times New Roman" w:eastAsia="Times New Roman"/>
+        </w:rPr>
+        <w:t>4.3.1</w:t>
+        <w:tab/>
+        <w:t>Pembentukan Matriks Jarak Awal</w:t>
+      </w:r>
+      <w:r>
+        <w:rPr>
+          <w:rFonts w:ascii="Times New Roman" w:hAnsi="Times New Roman"/>
+          <w:color w:val="FFFFFF"/>
+          <w:sz w:val="2"/>
+        </w:rPr>
+        <w:t xml:space="preserve"> ZT060</w:t>
+      </w:r>
+    </w:p>
+    <w:p>
+      <w:pPr>
+        <w:spacing w:line="360" w:lineRule="auto"/>
+        <w:ind w:firstLine="567"/>
+        <w:jc w:val="both"/>
+      </w:pPr>
+      <w:r>
+        <w:t>Langkah pertama adalah menghitung jarak Euclidean antar seluruh pasangan data. Karena terdapat 10 data, matriks jarak berukuran 10 x 10 dan bersifat simetris dengan diagonal nol. Matriks jarak awal ditampilkan pada Tabel 4.11.</w:t>
+      </w:r>
+    </w:p>
+    <w:p/>
+    <w:p>
+      <w:pPr>
+        <w:spacing w:line="240" w:lineRule="auto" w:after="120"/>
+        <w:jc w:val="left"/>
+      </w:pPr>
+      <w:r>
+        <w:rPr>
+          <w:rFonts w:ascii="Times New Roman" w:hAnsi="Times New Roman"/>
+          <w:b/>
+          <w:sz w:val="20"/>
+        </w:rPr>
+        <w:t>Tabel 4.11</w:t>
+      </w:r>
+      <w:r>
+        <w:rPr>
+          <w:rFonts w:ascii="Times New Roman" w:hAnsi="Times New Roman"/>
+          <w:b w:val="0"/>
+          <w:sz w:val="20"/>
+        </w:rPr>
+        <w:t xml:space="preserve"> Matriks Jarak Awal Antar Mahasiswa (Euclidean)</w:t>
+      </w:r>
+      <w:r>
+        <w:rPr>
+          <w:rFonts w:ascii="Times New Roman" w:hAnsi="Times New Roman"/>
+          <w:color w:val="FFFFFF"/>
+          <w:sz w:val="2"/>
+        </w:rPr>
+        <w:t xml:space="preserve"> ZT061</w:t>
+      </w:r>
+    </w:p>
+    <w:tbl>
+      <w:tblPr>
+        <w:jc w:val="center"/>
+        <w:tblLook w:firstColumn="1" w:firstRow="1" w:lastColumn="0" w:lastRow="0" w:noHBand="0" w:noVBand="1" w:val="04A0"/>
+        <w:tblBorders>
+          <w:top w:val="single" w:sz="4" w:space="0" w:color="000000"/>
+          <w:left w:val="single" w:sz="4" w:space="0" w:color="000000"/>
+          <w:bottom w:val="single" w:sz="4" w:space="0" w:color="000000"/>
+          <w:right w:val="single" w:sz="4" w:space="0" w:color="000000"/>
+          <w:insideH w:val="single" w:sz="4" w:space="0" w:color="000000"/>
+          <w:insideV w:val="single" w:sz="4" w:space="0" w:color="000000"/>
+        </w:tblBorders>
+        <w:tblW w:type="pct" w:w="5000"/>
       </w:tblPr>
       <w:tblGrid>
         <w:gridCol w:w="722"/>
@@ -15534,7 +15694,6 @@
     </w:p>
     <w:tbl>
       <w:tblPr>
-        <w:tblW w:type="auto" w:w="0"/>
         <w:jc w:val="center"/>
         <w:tblLook w:firstColumn="1" w:firstRow="1" w:lastColumn="0" w:lastRow="0" w:noHBand="0" w:noVBand="1" w:val="04A0"/>
         <w:tblBorders>
@@ -15545,6 +15704,7 @@
           <w:insideH w:val="single" w:sz="4" w:space="0" w:color="000000"/>
           <w:insideV w:val="single" w:sz="4" w:space="0" w:color="000000"/>
         </w:tblBorders>
+        <w:tblW w:type="pct" w:w="5000"/>
       </w:tblPr>
       <w:tblGrid>
         <w:gridCol w:w="1587"/>
@@ -17100,444 +17260,9 @@
         <w:t>Hasil seluruh proses penggabungan divisualisasikan dalam bentuk dendrogram pada Gambar 4.6. Garis putus-putus merah menunjukkan titik potong otomatis pada ketinggian sekitar 2.51.</w:t>
       </w:r>
     </w:p>
-    <w:p>
-      <w:pPr>
-        <w:spacing w:before="120"/>
-        <w:jc w:val="center"/>
-      </w:pPr>
-      <w:r>
-        <w:drawing>
-          <wp:inline xmlns:a="http://schemas.openxmlformats.org/drawingml/2006/main" xmlns:pic="http://schemas.openxmlformats.org/drawingml/2006/picture">
-            <wp:extent cx="4680000" cy="2600000"/>
-            <wp:docPr id="22" name="Picture 22"/>
-            <wp:cNvGraphicFramePr>
-              <a:graphicFrameLocks noChangeAspect="1"/>
-            </wp:cNvGraphicFramePr>
-            <a:graphic>
-              <a:graphicData uri="http://schemas.openxmlformats.org/drawingml/2006/picture">
-                <pic:pic>
-                  <pic:nvPicPr>
-                    <pic:cNvPr id="0" name="ag_dendrogram.png"/>
-                    <pic:cNvPicPr/>
-                  </pic:nvPicPr>
-                  <pic:blipFill>
-                    <a:blip r:embed="rId33"/>
-                    <a:stretch>
-                      <a:fillRect/>
-                    </a:stretch>
-                  </pic:blipFill>
-                  <pic:spPr>
-                    <a:xfrm>
-                      <a:off x="0" y="0"/>
-                      <a:ext cx="4680000" cy="2600000"/>
-                    </a:xfrm>
-                    <a:prstGeom prst="rect"/>
-                  </pic:spPr>
-                </pic:pic>
-              </a:graphicData>
-            </a:graphic>
-          </wp:inline>
-        </w:drawing>
-      </w:r>
-    </w:p>
-    <w:p>
-      <w:pPr>
-        <w:spacing w:line="240" w:lineRule="auto" w:after="120"/>
-        <w:jc w:val="center"/>
-      </w:pPr>
-      <w:r>
-        <w:rPr>
-          <w:rFonts w:ascii="Times New Roman" w:hAnsi="Times New Roman"/>
-          <w:b/>
-          <w:sz w:val="20"/>
-        </w:rPr>
-        <w:t>Gambar 4.6</w:t>
-      </w:r>
-      <w:r>
-        <w:rPr>
-          <w:rFonts w:ascii="Times New Roman" w:hAnsi="Times New Roman"/>
-          <w:b w:val="0"/>
-          <w:sz w:val="20"/>
-        </w:rPr>
-        <w:t xml:space="preserve"> Dendrogram Agglomerative Single Linkage</w:t>
-      </w:r>
-      <w:r>
-        <w:rPr>
-          <w:rFonts w:ascii="Times New Roman" w:hAnsi="Times New Roman"/>
-          <w:color w:val="FFFFFF"/>
-          <w:sz w:val="2"/>
-        </w:rPr>
-        <w:t xml:space="preserve"> ZF067</w:t>
-      </w:r>
-    </w:p>
-    <w:p>
-      <w:pPr>
-        <w:spacing w:line="360" w:lineRule="auto"/>
-        <w:ind w:firstLine="567"/>
-        <w:jc w:val="both"/>
-      </w:pPr>
-      <w:r>
-        <w:t>Penentuan jumlah klaster dilakukan dengan mengamati lompatan ketinggian penggabungan. Urutan ketinggian adalah 1.0 (enam kali), 1.414, 3.606, dan 4.243. Lompatan terbesar bernilai 2.191 yaitu antara 1.414 dan 3.606. Lompatan ini terjadi ketika algoritma mulai menggabungkan dua kelompok berbeda, sehingga titik potong diletakkan tepat di bawahnya dan menghasilkan tiga klaster, bukan dua. Hal ini menegaskan bahwa algoritma Agglomerative tidak berhenti di dua klaster, melainkan berjalan sampai satu klaster, dan jumlah klaster final ditentukan oleh karakteristik data. Hasil pengelompokan tiga klaster ditampilkan pada Gambar 4.7.</w:t>
-      </w:r>
-    </w:p>
-    <w:p>
-      <w:pPr>
-        <w:spacing w:before="120"/>
-        <w:jc w:val="center"/>
-      </w:pPr>
-      <w:r>
-        <w:drawing>
-          <wp:inline xmlns:a="http://schemas.openxmlformats.org/drawingml/2006/main" xmlns:pic="http://schemas.openxmlformats.org/drawingml/2006/picture">
-            <wp:extent cx="3960000" cy="3111429"/>
-            <wp:docPr id="23" name="Picture 23"/>
-            <wp:cNvGraphicFramePr>
-              <a:graphicFrameLocks noChangeAspect="1"/>
-            </wp:cNvGraphicFramePr>
-            <a:graphic>
-              <a:graphicData uri="http://schemas.openxmlformats.org/drawingml/2006/picture">
-                <pic:pic>
-                  <pic:nvPicPr>
-                    <pic:cNvPr id="0" name="ag_hasil.png"/>
-                    <pic:cNvPicPr/>
-                  </pic:nvPicPr>
-                  <pic:blipFill>
-                    <a:blip r:embed="rId34"/>
-                    <a:stretch>
-                      <a:fillRect/>
-                    </a:stretch>
-                  </pic:blipFill>
-                  <pic:spPr>
-                    <a:xfrm>
-                      <a:off x="0" y="0"/>
-                      <a:ext cx="3960000" cy="3111429"/>
-                    </a:xfrm>
-                    <a:prstGeom prst="rect"/>
-                  </pic:spPr>
-                </pic:pic>
-              </a:graphicData>
-            </a:graphic>
-          </wp:inline>
-        </w:drawing>
-      </w:r>
-    </w:p>
-    <w:p>
-      <w:pPr>
-        <w:spacing w:line="240" w:lineRule="auto" w:after="120"/>
-        <w:jc w:val="center"/>
-      </w:pPr>
-      <w:r>
-        <w:rPr>
-          <w:rFonts w:ascii="Times New Roman" w:hAnsi="Times New Roman"/>
-          <w:b/>
-          <w:sz w:val="20"/>
-        </w:rPr>
-        <w:t>Gambar 4.7</w:t>
-      </w:r>
-      <w:r>
-        <w:rPr>
-          <w:rFonts w:ascii="Times New Roman" w:hAnsi="Times New Roman"/>
-          <w:b w:val="0"/>
-          <w:sz w:val="20"/>
-        </w:rPr>
-        <w:t xml:space="preserve"> Hasil Pengelompokan Tiga Klaster</w:t>
-      </w:r>
-      <w:r>
-        <w:rPr>
-          <w:rFonts w:ascii="Times New Roman" w:hAnsi="Times New Roman"/>
-          <w:color w:val="FFFFFF"/>
-          <w:sz w:val="2"/>
-        </w:rPr>
-        <w:t xml:space="preserve"> ZF068</w:t>
-      </w:r>
-    </w:p>
-    <w:p>
-      <w:pPr>
-        <w:spacing w:line="360" w:lineRule="auto"/>
-        <w:ind w:firstLine="567"/>
-        <w:jc w:val="both"/>
-      </w:pPr>
-      <w:r>
-        <w:t>Untuk menegaskan bahwa jumlah klaster bergantung pada letak pemotongan dendrogram, dilakukan pemotongan menjadi 2, 3, dan 4 klaster. Hasilnya ditampilkan pada Gambar 4.8.</w:t>
-      </w:r>
-    </w:p>
-    <w:p>
-      <w:pPr>
-        <w:spacing w:before="120"/>
-        <w:jc w:val="center"/>
-      </w:pPr>
-      <w:r>
-        <w:drawing>
-          <wp:inline xmlns:a="http://schemas.openxmlformats.org/drawingml/2006/main" xmlns:pic="http://schemas.openxmlformats.org/drawingml/2006/picture">
-            <wp:extent cx="5040000" cy="1620000"/>
-            <wp:docPr id="24" name="Picture 24"/>
-            <wp:cNvGraphicFramePr>
-              <a:graphicFrameLocks noChangeAspect="1"/>
-            </wp:cNvGraphicFramePr>
-            <a:graphic>
-              <a:graphicData uri="http://schemas.openxmlformats.org/drawingml/2006/picture">
-                <pic:pic>
-                  <pic:nvPicPr>
-                    <pic:cNvPr id="0" name="ag_potong.png"/>
-                    <pic:cNvPicPr/>
-                  </pic:nvPicPr>
-                  <pic:blipFill>
-                    <a:blip r:embed="rId35"/>
-                    <a:stretch>
-                      <a:fillRect/>
-                    </a:stretch>
-                  </pic:blipFill>
-                  <pic:spPr>
-                    <a:xfrm>
-                      <a:off x="0" y="0"/>
-                      <a:ext cx="5040000" cy="1620000"/>
-                    </a:xfrm>
-                    <a:prstGeom prst="rect"/>
-                  </pic:spPr>
-                </pic:pic>
-              </a:graphicData>
-            </a:graphic>
-          </wp:inline>
-        </w:drawing>
-      </w:r>
-    </w:p>
-    <w:p>
-      <w:pPr>
-        <w:spacing w:line="240" w:lineRule="auto" w:after="120"/>
-        <w:jc w:val="center"/>
-      </w:pPr>
-      <w:r>
-        <w:rPr>
-          <w:rFonts w:ascii="Times New Roman" w:hAnsi="Times New Roman"/>
-          <w:b/>
-          <w:sz w:val="20"/>
-        </w:rPr>
-        <w:t>Gambar 4.8</w:t>
-      </w:r>
-      <w:r>
-        <w:rPr>
-          <w:rFonts w:ascii="Times New Roman" w:hAnsi="Times New Roman"/>
-          <w:b w:val="0"/>
-          <w:sz w:val="20"/>
-        </w:rPr>
-        <w:t xml:space="preserve"> Perbandingan Pemotongan Dendrogram menjadi 2, 3, dan 4 Klaster</w:t>
-      </w:r>
-      <w:r>
-        <w:rPr>
-          <w:rFonts w:ascii="Times New Roman" w:hAnsi="Times New Roman"/>
-          <w:color w:val="FFFFFF"/>
-          <w:sz w:val="2"/>
-        </w:rPr>
-        <w:t xml:space="preserve"> ZF069</w:t>
-      </w:r>
-    </w:p>
-    <w:p>
-      <w:pPr>
-        <w:spacing w:line="360" w:lineRule="auto"/>
-        <w:ind w:firstLine="567"/>
-        <w:jc w:val="both"/>
-      </w:pPr>
-      <w:r>
-        <w:t>Pada Gambar 4.8 terlihat bahwa pemotongan menjadi 2 klaster menggabungkan kelompok menengah (D, E, F) ke salah satu kelompok besar sehingga kurang merepresentasikan struktur data yang sebenarnya. Pemotongan menjadi 3 klaster menghasilkan pemisahan yang paling bersih, di mana ketiga kelompok yaitu nilai rendah {A, B, C}, nilai menengah {D, E, F}, dan nilai tinggi {G, H, I, J} terpisah dengan jelas sesuai sebaran data asli. Pemotongan menjadi 4 klaster mulai memecah salah satu kelompok sehingga terjadi over-segmentasi, di mana salah satu klaster hanya berisi sedikit anggota. Hal ini menegaskan bahwa pemilihan letak pemotongan dendrogram secara langsung menentukan jumlah dan kualitas klaster final, dan untuk data ini tiga klaster merupakan pilihan paling sesuai.</w:t>
-      </w:r>
-    </w:p>
-    <w:p>
-      <w:pPr>
-        <w:spacing w:line="360" w:lineRule="auto"/>
-        <w:ind w:firstLine="567"/>
-        <w:jc w:val="both"/>
-      </w:pPr>
-      <w:r>
-        <w:t>Selain pengaruh letak pemotongan, dilakukan pula perbandingan empat metode linkage (single, complete, average, dan ward) untuk melihat apakah pilihan metode mempengaruhi hasil klaster. Hasilnya ditampilkan pada Gambar 4.9.</w:t>
-      </w:r>
-    </w:p>
-    <w:p>
-      <w:pPr>
-        <w:spacing w:before="120"/>
-        <w:jc w:val="center"/>
-      </w:pPr>
-      <w:r>
-        <w:drawing>
-          <wp:inline xmlns:a="http://schemas.openxmlformats.org/drawingml/2006/main" xmlns:pic="http://schemas.openxmlformats.org/drawingml/2006/picture">
-            <wp:extent cx="4680000" cy="3120000"/>
-            <wp:docPr id="25" name="Picture 25"/>
-            <wp:cNvGraphicFramePr>
-              <a:graphicFrameLocks noChangeAspect="1"/>
-            </wp:cNvGraphicFramePr>
-            <a:graphic>
-              <a:graphicData uri="http://schemas.openxmlformats.org/drawingml/2006/picture">
-                <pic:pic>
-                  <pic:nvPicPr>
-                    <pic:cNvPr id="0" name="ag_linkage.png"/>
-                    <pic:cNvPicPr/>
-                  </pic:nvPicPr>
-                  <pic:blipFill>
-                    <a:blip r:embed="rId36"/>
-                    <a:stretch>
-                      <a:fillRect/>
-                    </a:stretch>
-                  </pic:blipFill>
-                  <pic:spPr>
-                    <a:xfrm>
-                      <a:off x="0" y="0"/>
-                      <a:ext cx="4680000" cy="3120000"/>
-                    </a:xfrm>
-                    <a:prstGeom prst="rect"/>
-                  </pic:spPr>
-                </pic:pic>
-              </a:graphicData>
-            </a:graphic>
-          </wp:inline>
-        </w:drawing>
-      </w:r>
-    </w:p>
-    <w:p>
-      <w:pPr>
-        <w:spacing w:line="240" w:lineRule="auto" w:after="120"/>
-        <w:jc w:val="center"/>
-      </w:pPr>
-      <w:r>
-        <w:rPr>
-          <w:rFonts w:ascii="Times New Roman" w:hAnsi="Times New Roman"/>
-          <w:b/>
-          <w:sz w:val="20"/>
-        </w:rPr>
-        <w:t>Gambar 4.9</w:t>
-      </w:r>
-      <w:r>
-        <w:rPr>
-          <w:rFonts w:ascii="Times New Roman" w:hAnsi="Times New Roman"/>
-          <w:b w:val="0"/>
-          <w:sz w:val="20"/>
-        </w:rPr>
-        <w:t xml:space="preserve"> Perbandingan Empat Metode Linkage</w:t>
-      </w:r>
-      <w:r>
-        <w:rPr>
-          <w:rFonts w:ascii="Times New Roman" w:hAnsi="Times New Roman"/>
-          <w:color w:val="FFFFFF"/>
-          <w:sz w:val="2"/>
-        </w:rPr>
-        <w:t xml:space="preserve"> ZF070</w:t>
-      </w:r>
-    </w:p>
-    <w:p>
-      <w:pPr>
-        <w:spacing w:line="360" w:lineRule="auto"/>
-        <w:ind w:firstLine="567"/>
-        <w:jc w:val="both"/>
-      </w:pPr>
-      <w:r>
-        <w:t>Pada Gambar 4.9 terlihat bahwa keempat metode linkage menghasilkan struktur hirarki yang serupa, yaitu tiga klaster yang sama: {A, B, C}, {D, E, F}, dan {G, H, I, J}. Perbedaan utama terletak pada skala ketinggian penggabungan. Metode single linkage menghasilkan jarak penggabungan paling rendah karena mengambil nilai minimum antar anggota, sedangkan complete linkage menghasilkan skala paling tinggi karena memilih jarak maksimum antar anggota. Metode average dan ward berada di antaranya dengan pola yang lebih halus. Karena ketiga kelompok pada data terpisah cukup jelas, pilihan metode linkage tidak mengubah hasil klaster final, melainkan hanya mempengaruhi skala ketinggian pada dendrogram. Hal ini menunjukkan bahwa pada data dengan kelompok yang terpisah baik, Agglomerative Clustering bersifat robust terhadap pilihan metode linkage.</w:t>
-      </w:r>
-    </w:p>
-    <w:p>
-      <w:r>
-        <w:br w:type="page"/>
-      </w:r>
-    </w:p>
-    <w:p>
-      <w:pPr>
-        <w:pStyle w:val="Heading2"/>
-        <w:tabs>
-          <w:tab w:pos="567" w:val="left"/>
-        </w:tabs>
-        <w:ind w:left="0"/>
-      </w:pPr>
-      <w:r>
-        <w:rPr>
-          <w:rFonts w:ascii="Times New Roman" w:hAnsi="Times New Roman" w:cs="Times New Roman" w:eastAsia="Times New Roman"/>
-        </w:rPr>
-        <w:t>4.4</w:t>
-        <w:tab/>
-        <w:t>Analisis Pengaruh Centroid Awal terhadap Outlier</w:t>
-      </w:r>
-      <w:r>
-        <w:rPr>
-          <w:rFonts w:ascii="Times New Roman" w:hAnsi="Times New Roman"/>
-          <w:color w:val="FFFFFF"/>
-          <w:sz w:val="2"/>
-        </w:rPr>
-        <w:t xml:space="preserve"> ZT071</w:t>
-      </w:r>
-    </w:p>
-    <w:p>
-      <w:pPr>
-        <w:spacing w:line="360" w:lineRule="auto"/>
-        <w:ind w:firstLine="567"/>
-        <w:jc w:val="both"/>
-      </w:pPr>
-      <w:r>
-        <w:t>Perhitungan pada subbab 4.2.1 memakai centroid awal yang berada di dalam sebaran data. Untuk menguji sensitivitas K-Means terhadap pemilihan centroid awal, dilakukan percobaan tambahan dengan menempatkan salah satu centroid awal tepat di titik terjauh (outlier) dari kerumunan data. Jarak setiap titik terhadap rata-rata data dihitung, dan diperoleh P5 = (47, 253) sebagai titik terjauh (berada di luar layer/kerumunan) serta P6 = (40, 81) sebagai titik paling sentral (di dalam layer). Dua skenario dibandingkan, dengan centroid kedua sengaja dibuat sama (C2 tetap = P2) agar perbedaan hasil murni disebabkan oleh perpindahan centroid pertama.</w:t>
-      </w:r>
-    </w:p>
-    <w:p>
-      <w:pPr>
-        <w:spacing w:line="360" w:lineRule="auto"/>
-        <w:ind w:left="567" w:hanging="567"/>
-        <w:jc w:val="both"/>
-      </w:pPr>
-      <w:r>
-        <w:t>1.</w:t>
-        <w:tab/>
-        <w:t>Skenario A (di dalam layer): centroid awal C1 = P6 (40, 81) dan C2 = P2 (47, 100).</w:t>
-      </w:r>
-    </w:p>
-    <w:p>
-      <w:pPr>
-        <w:spacing w:line="360" w:lineRule="auto"/>
-        <w:ind w:left="567" w:hanging="567"/>
-        <w:jc w:val="both"/>
-      </w:pPr>
-      <w:r>
-        <w:t>2.</w:t>
-        <w:tab/>
-        <w:t>Skenario B (di luar layer): centroid awal C1 = P5 (47, 253) (titik terjauh) dan C2 = P2 (47, 100).</w:t>
-      </w:r>
-    </w:p>
-    <w:p>
-      <w:pPr>
-        <w:spacing w:line="360" w:lineRule="auto"/>
-        <w:ind w:firstLine="567"/>
-        <w:jc w:val="both"/>
-      </w:pPr>
-      <w:r>
-        <w:t>Percobaan ini menjawab dua pertanyaan: (1) apa yang berbeda jika centroid awal diletakkan di titik terjauh/outlier, dan (2) apakah anggota klaster berubah atau tetap sama. Perbandingan kedua skenario ditampilkan pada Tabel 4.13 dan divisualisasikan pada Gambar 4.10.</w:t>
-      </w:r>
-    </w:p>
     <w:p/>
-    <w:p>
-      <w:pPr>
-        <w:spacing w:line="240" w:lineRule="auto" w:after="120"/>
-        <w:jc w:val="left"/>
-      </w:pPr>
-      <w:r>
-        <w:rPr>
-          <w:rFonts w:ascii="Times New Roman" w:hAnsi="Times New Roman"/>
-          <w:b/>
-          <w:sz w:val="20"/>
-        </w:rPr>
-        <w:t>Tabel 4.13</w:t>
-      </w:r>
-      <w:r>
-        <w:rPr>
-          <w:rFonts w:ascii="Times New Roman" w:hAnsi="Times New Roman"/>
-          <w:b w:val="0"/>
-          <w:sz w:val="20"/>
-        </w:rPr>
-        <w:t xml:space="preserve"> Perbandingan Centroid Awal di Dalam vs di Luar Layer</w:t>
-      </w:r>
-      <w:r>
-        <w:rPr>
-          <w:rFonts w:ascii="Times New Roman" w:hAnsi="Times New Roman"/>
-          <w:color w:val="FFFFFF"/>
-          <w:sz w:val="2"/>
-        </w:rPr>
-        <w:t xml:space="preserve"> ZT072</w:t>
-      </w:r>
-    </w:p>
     <w:tbl>
       <w:tblPr>
-        <w:tblW w:type="auto" w:w="0"/>
         <w:jc w:val="center"/>
         <w:tblLook w:firstColumn="1" w:firstRow="1" w:lastColumn="0" w:lastRow="0" w:noHBand="0" w:noVBand="1" w:val="04A0"/>
         <w:tblBorders>
@@ -17548,6 +17273,569 @@
           <w:insideH w:val="single" w:sz="4" w:space="0" w:color="000000"/>
           <w:insideV w:val="single" w:sz="4" w:space="0" w:color="000000"/>
         </w:tblBorders>
+        <w:tblW w:type="pct" w:w="5000"/>
+        <w:tblCellMar>
+          <w:top w:w="40" w:type="dxa"/>
+          <w:bottom w:w="40" w:type="dxa"/>
+          <w:left w:w="40" w:type="dxa"/>
+          <w:right w:w="40" w:type="dxa"/>
+        </w:tblCellMar>
+      </w:tblPr>
+      <w:tblGrid>
+        <w:gridCol w:w="7937"/>
+      </w:tblGrid>
+      <w:tr>
+        <w:tc>
+          <w:tcPr>
+            <w:tcW w:type="dxa" w:w="7937"/>
+          </w:tcPr>
+          <w:p>
+            <w:pPr>
+              <w:spacing w:before="0" w:after="0"/>
+              <w:jc w:val="center"/>
+            </w:pPr>
+            <w:r>
+              <w:drawing>
+                <wp:inline xmlns:a="http://schemas.openxmlformats.org/drawingml/2006/main" xmlns:pic="http://schemas.openxmlformats.org/drawingml/2006/picture">
+                  <wp:extent cx="4680000" cy="2600000"/>
+                  <wp:docPr id="22" name="Picture 22"/>
+                  <wp:cNvGraphicFramePr>
+                    <a:graphicFrameLocks noChangeAspect="1"/>
+                  </wp:cNvGraphicFramePr>
+                  <a:graphic>
+                    <a:graphicData uri="http://schemas.openxmlformats.org/drawingml/2006/picture">
+                      <pic:pic>
+                        <pic:nvPicPr>
+                          <pic:cNvPr id="0" name="ag_dendrogram.png"/>
+                          <pic:cNvPicPr/>
+                        </pic:nvPicPr>
+                        <pic:blipFill>
+                          <a:blip r:embed="rId33"/>
+                          <a:stretch>
+                            <a:fillRect/>
+                          </a:stretch>
+                        </pic:blipFill>
+                        <pic:spPr>
+                          <a:xfrm>
+                            <a:off x="0" y="0"/>
+                            <a:ext cx="4680000" cy="2600000"/>
+                          </a:xfrm>
+                          <a:prstGeom prst="rect"/>
+                        </pic:spPr>
+                      </pic:pic>
+                    </a:graphicData>
+                  </a:graphic>
+                </wp:inline>
+              </w:drawing>
+            </w:r>
+          </w:p>
+        </w:tc>
+      </w:tr>
+    </w:tbl>
+    <w:p>
+      <w:pPr>
+        <w:spacing w:line="240" w:lineRule="auto" w:after="120"/>
+        <w:jc w:val="center"/>
+      </w:pPr>
+      <w:r>
+        <w:rPr>
+          <w:rFonts w:ascii="Times New Roman" w:hAnsi="Times New Roman"/>
+          <w:b/>
+          <w:sz w:val="20"/>
+        </w:rPr>
+        <w:t>Gambar 4.6</w:t>
+      </w:r>
+      <w:r>
+        <w:rPr>
+          <w:rFonts w:ascii="Times New Roman" w:hAnsi="Times New Roman"/>
+          <w:b w:val="0"/>
+          <w:sz w:val="20"/>
+        </w:rPr>
+        <w:t xml:space="preserve"> Dendrogram Agglomerative Single Linkage</w:t>
+      </w:r>
+      <w:r>
+        <w:rPr>
+          <w:rFonts w:ascii="Times New Roman" w:hAnsi="Times New Roman"/>
+          <w:color w:val="FFFFFF"/>
+          <w:sz w:val="2"/>
+        </w:rPr>
+        <w:t xml:space="preserve"> ZF067</w:t>
+      </w:r>
+    </w:p>
+    <w:p>
+      <w:pPr>
+        <w:spacing w:line="360" w:lineRule="auto"/>
+        <w:ind w:firstLine="567"/>
+        <w:jc w:val="both"/>
+      </w:pPr>
+      <w:r>
+        <w:t>Penentuan jumlah klaster dilakukan dengan mengamati lompatan ketinggian penggabungan. Urutan ketinggian adalah 1.0 (enam kali), 1.414, 3.606, dan 4.243. Lompatan terbesar bernilai 2.191 yaitu antara 1.414 dan 3.606. Lompatan ini terjadi ketika algoritma mulai menggabungkan dua kelompok berbeda, sehingga titik potong diletakkan tepat di bawahnya dan menghasilkan tiga klaster, bukan dua. Hal ini menegaskan bahwa algoritma Agglomerative tidak berhenti di dua klaster, melainkan berjalan sampai satu klaster, dan jumlah klaster final ditentukan oleh karakteristik data. Hasil pengelompokan tiga klaster ditampilkan pada Gambar 4.7.</w:t>
+      </w:r>
+    </w:p>
+    <w:p/>
+    <w:tbl>
+      <w:tblPr>
+        <w:jc w:val="center"/>
+        <w:tblLook w:firstColumn="1" w:firstRow="1" w:lastColumn="0" w:lastRow="0" w:noHBand="0" w:noVBand="1" w:val="04A0"/>
+        <w:tblBorders>
+          <w:top w:val="single" w:sz="4" w:space="0" w:color="000000"/>
+          <w:left w:val="single" w:sz="4" w:space="0" w:color="000000"/>
+          <w:bottom w:val="single" w:sz="4" w:space="0" w:color="000000"/>
+          <w:right w:val="single" w:sz="4" w:space="0" w:color="000000"/>
+          <w:insideH w:val="single" w:sz="4" w:space="0" w:color="000000"/>
+          <w:insideV w:val="single" w:sz="4" w:space="0" w:color="000000"/>
+        </w:tblBorders>
+        <w:tblW w:type="pct" w:w="5000"/>
+        <w:tblCellMar>
+          <w:top w:w="40" w:type="dxa"/>
+          <w:bottom w:w="40" w:type="dxa"/>
+          <w:left w:w="40" w:type="dxa"/>
+          <w:right w:w="40" w:type="dxa"/>
+        </w:tblCellMar>
+      </w:tblPr>
+      <w:tblGrid>
+        <w:gridCol w:w="7937"/>
+      </w:tblGrid>
+      <w:tr>
+        <w:tc>
+          <w:tcPr>
+            <w:tcW w:type="dxa" w:w="7937"/>
+          </w:tcPr>
+          <w:p>
+            <w:pPr>
+              <w:spacing w:before="0" w:after="0"/>
+              <w:jc w:val="center"/>
+            </w:pPr>
+            <w:r>
+              <w:drawing>
+                <wp:inline xmlns:a="http://schemas.openxmlformats.org/drawingml/2006/main" xmlns:pic="http://schemas.openxmlformats.org/drawingml/2006/picture">
+                  <wp:extent cx="3960000" cy="3111429"/>
+                  <wp:docPr id="23" name="Picture 23"/>
+                  <wp:cNvGraphicFramePr>
+                    <a:graphicFrameLocks noChangeAspect="1"/>
+                  </wp:cNvGraphicFramePr>
+                  <a:graphic>
+                    <a:graphicData uri="http://schemas.openxmlformats.org/drawingml/2006/picture">
+                      <pic:pic>
+                        <pic:nvPicPr>
+                          <pic:cNvPr id="0" name="ag_hasil.png"/>
+                          <pic:cNvPicPr/>
+                        </pic:nvPicPr>
+                        <pic:blipFill>
+                          <a:blip r:embed="rId34"/>
+                          <a:stretch>
+                            <a:fillRect/>
+                          </a:stretch>
+                        </pic:blipFill>
+                        <pic:spPr>
+                          <a:xfrm>
+                            <a:off x="0" y="0"/>
+                            <a:ext cx="3960000" cy="3111429"/>
+                          </a:xfrm>
+                          <a:prstGeom prst="rect"/>
+                        </pic:spPr>
+                      </pic:pic>
+                    </a:graphicData>
+                  </a:graphic>
+                </wp:inline>
+              </w:drawing>
+            </w:r>
+          </w:p>
+        </w:tc>
+      </w:tr>
+    </w:tbl>
+    <w:p>
+      <w:pPr>
+        <w:spacing w:line="240" w:lineRule="auto" w:after="120"/>
+        <w:jc w:val="center"/>
+      </w:pPr>
+      <w:r>
+        <w:rPr>
+          <w:rFonts w:ascii="Times New Roman" w:hAnsi="Times New Roman"/>
+          <w:b/>
+          <w:sz w:val="20"/>
+        </w:rPr>
+        <w:t>Gambar 4.7</w:t>
+      </w:r>
+      <w:r>
+        <w:rPr>
+          <w:rFonts w:ascii="Times New Roman" w:hAnsi="Times New Roman"/>
+          <w:b w:val="0"/>
+          <w:sz w:val="20"/>
+        </w:rPr>
+        <w:t xml:space="preserve"> Hasil Pengelompokan Tiga Klaster</w:t>
+      </w:r>
+      <w:r>
+        <w:rPr>
+          <w:rFonts w:ascii="Times New Roman" w:hAnsi="Times New Roman"/>
+          <w:color w:val="FFFFFF"/>
+          <w:sz w:val="2"/>
+        </w:rPr>
+        <w:t xml:space="preserve"> ZF068</w:t>
+      </w:r>
+    </w:p>
+    <w:p>
+      <w:pPr>
+        <w:spacing w:line="360" w:lineRule="auto"/>
+        <w:ind w:firstLine="567"/>
+        <w:jc w:val="both"/>
+      </w:pPr>
+      <w:r>
+        <w:t>Untuk menegaskan bahwa jumlah klaster bergantung pada letak pemotongan dendrogram, dilakukan pemotongan menjadi 2, 3, dan 4 klaster. Hasilnya ditampilkan pada Gambar 4.8.</w:t>
+      </w:r>
+    </w:p>
+    <w:p/>
+    <w:tbl>
+      <w:tblPr>
+        <w:jc w:val="center"/>
+        <w:tblLook w:firstColumn="1" w:firstRow="1" w:lastColumn="0" w:lastRow="0" w:noHBand="0" w:noVBand="1" w:val="04A0"/>
+        <w:tblBorders>
+          <w:top w:val="single" w:sz="4" w:space="0" w:color="000000"/>
+          <w:left w:val="single" w:sz="4" w:space="0" w:color="000000"/>
+          <w:bottom w:val="single" w:sz="4" w:space="0" w:color="000000"/>
+          <w:right w:val="single" w:sz="4" w:space="0" w:color="000000"/>
+          <w:insideH w:val="single" w:sz="4" w:space="0" w:color="000000"/>
+          <w:insideV w:val="single" w:sz="4" w:space="0" w:color="000000"/>
+        </w:tblBorders>
+        <w:tblW w:type="pct" w:w="5000"/>
+        <w:tblCellMar>
+          <w:top w:w="40" w:type="dxa"/>
+          <w:bottom w:w="40" w:type="dxa"/>
+          <w:left w:w="40" w:type="dxa"/>
+          <w:right w:w="40" w:type="dxa"/>
+        </w:tblCellMar>
+      </w:tblPr>
+      <w:tblGrid>
+        <w:gridCol w:w="7937"/>
+      </w:tblGrid>
+      <w:tr>
+        <w:tc>
+          <w:tcPr>
+            <w:tcW w:type="dxa" w:w="7937"/>
+          </w:tcPr>
+          <w:p>
+            <w:pPr>
+              <w:spacing w:before="0" w:after="0"/>
+              <w:jc w:val="center"/>
+            </w:pPr>
+            <w:r>
+              <w:drawing>
+                <wp:inline xmlns:a="http://schemas.openxmlformats.org/drawingml/2006/main" xmlns:pic="http://schemas.openxmlformats.org/drawingml/2006/picture">
+                  <wp:extent cx="4860000" cy="1562143"/>
+                  <wp:docPr id="24" name="Picture 24"/>
+                  <wp:cNvGraphicFramePr>
+                    <a:graphicFrameLocks noChangeAspect="1"/>
+                  </wp:cNvGraphicFramePr>
+                  <a:graphic>
+                    <a:graphicData uri="http://schemas.openxmlformats.org/drawingml/2006/picture">
+                      <pic:pic>
+                        <pic:nvPicPr>
+                          <pic:cNvPr id="0" name="ag_potong.png"/>
+                          <pic:cNvPicPr/>
+                        </pic:nvPicPr>
+                        <pic:blipFill>
+                          <a:blip r:embed="rId35"/>
+                          <a:stretch>
+                            <a:fillRect/>
+                          </a:stretch>
+                        </pic:blipFill>
+                        <pic:spPr>
+                          <a:xfrm>
+                            <a:off x="0" y="0"/>
+                            <a:ext cx="4860000" cy="1562143"/>
+                          </a:xfrm>
+                          <a:prstGeom prst="rect"/>
+                        </pic:spPr>
+                      </pic:pic>
+                    </a:graphicData>
+                  </a:graphic>
+                </wp:inline>
+              </w:drawing>
+            </w:r>
+          </w:p>
+        </w:tc>
+      </w:tr>
+    </w:tbl>
+    <w:p>
+      <w:pPr>
+        <w:spacing w:line="240" w:lineRule="auto" w:after="120"/>
+        <w:jc w:val="center"/>
+      </w:pPr>
+      <w:r>
+        <w:rPr>
+          <w:rFonts w:ascii="Times New Roman" w:hAnsi="Times New Roman"/>
+          <w:b/>
+          <w:sz w:val="20"/>
+        </w:rPr>
+        <w:t>Gambar 4.8</w:t>
+      </w:r>
+      <w:r>
+        <w:rPr>
+          <w:rFonts w:ascii="Times New Roman" w:hAnsi="Times New Roman"/>
+          <w:b w:val="0"/>
+          <w:sz w:val="20"/>
+        </w:rPr>
+        <w:t xml:space="preserve"> Perbandingan Pemotongan Dendrogram menjadi 2, 3, dan 4 Klaster</w:t>
+      </w:r>
+      <w:r>
+        <w:rPr>
+          <w:rFonts w:ascii="Times New Roman" w:hAnsi="Times New Roman"/>
+          <w:color w:val="FFFFFF"/>
+          <w:sz w:val="2"/>
+        </w:rPr>
+        <w:t xml:space="preserve"> ZF069</w:t>
+      </w:r>
+    </w:p>
+    <w:p>
+      <w:pPr>
+        <w:spacing w:line="360" w:lineRule="auto"/>
+        <w:ind w:firstLine="567"/>
+        <w:jc w:val="both"/>
+      </w:pPr>
+      <w:r>
+        <w:t>Pada Gambar 4.8 terlihat bahwa pemotongan menjadi 2 klaster menggabungkan kelompok menengah (D, E, F) ke salah satu kelompok besar sehingga kurang merepresentasikan struktur data yang sebenarnya. Pemotongan menjadi 3 klaster menghasilkan pemisahan yang paling bersih, di mana ketiga kelompok yaitu nilai rendah {A, B, C}, nilai menengah {D, E, F}, dan nilai tinggi {G, H, I, J} terpisah dengan jelas sesuai sebaran data asli. Pemotongan menjadi 4 klaster mulai memecah salah satu kelompok sehingga terjadi over-segmentasi, di mana salah satu klaster hanya berisi sedikit anggota. Hal ini menegaskan bahwa pemilihan letak pemotongan dendrogram secara langsung menentukan jumlah dan kualitas klaster final, dan untuk data ini tiga klaster merupakan pilihan paling sesuai.</w:t>
+      </w:r>
+    </w:p>
+    <w:p>
+      <w:pPr>
+        <w:spacing w:line="360" w:lineRule="auto"/>
+        <w:ind w:firstLine="567"/>
+        <w:jc w:val="both"/>
+      </w:pPr>
+      <w:r>
+        <w:t>Selain pengaruh letak pemotongan, dilakukan pula perbandingan empat metode linkage (single, complete, average, dan ward) untuk melihat apakah pilihan metode mempengaruhi hasil klaster. Hasilnya ditampilkan pada Gambar 4.9.</w:t>
+      </w:r>
+    </w:p>
+    <w:p/>
+    <w:tbl>
+      <w:tblPr>
+        <w:jc w:val="center"/>
+        <w:tblLook w:firstColumn="1" w:firstRow="1" w:lastColumn="0" w:lastRow="0" w:noHBand="0" w:noVBand="1" w:val="04A0"/>
+        <w:tblBorders>
+          <w:top w:val="single" w:sz="4" w:space="0" w:color="000000"/>
+          <w:left w:val="single" w:sz="4" w:space="0" w:color="000000"/>
+          <w:bottom w:val="single" w:sz="4" w:space="0" w:color="000000"/>
+          <w:right w:val="single" w:sz="4" w:space="0" w:color="000000"/>
+          <w:insideH w:val="single" w:sz="4" w:space="0" w:color="000000"/>
+          <w:insideV w:val="single" w:sz="4" w:space="0" w:color="000000"/>
+        </w:tblBorders>
+        <w:tblW w:type="pct" w:w="5000"/>
+        <w:tblCellMar>
+          <w:top w:w="40" w:type="dxa"/>
+          <w:bottom w:w="40" w:type="dxa"/>
+          <w:left w:w="40" w:type="dxa"/>
+          <w:right w:w="40" w:type="dxa"/>
+        </w:tblCellMar>
+      </w:tblPr>
+      <w:tblGrid>
+        <w:gridCol w:w="7937"/>
+      </w:tblGrid>
+      <w:tr>
+        <w:tc>
+          <w:tcPr>
+            <w:tcW w:type="dxa" w:w="7937"/>
+          </w:tcPr>
+          <w:p>
+            <w:pPr>
+              <w:spacing w:before="0" w:after="0"/>
+              <w:jc w:val="center"/>
+            </w:pPr>
+            <w:r>
+              <w:drawing>
+                <wp:inline xmlns:a="http://schemas.openxmlformats.org/drawingml/2006/main" xmlns:pic="http://schemas.openxmlformats.org/drawingml/2006/picture">
+                  <wp:extent cx="4680000" cy="3120000"/>
+                  <wp:docPr id="25" name="Picture 25"/>
+                  <wp:cNvGraphicFramePr>
+                    <a:graphicFrameLocks noChangeAspect="1"/>
+                  </wp:cNvGraphicFramePr>
+                  <a:graphic>
+                    <a:graphicData uri="http://schemas.openxmlformats.org/drawingml/2006/picture">
+                      <pic:pic>
+                        <pic:nvPicPr>
+                          <pic:cNvPr id="0" name="ag_linkage.png"/>
+                          <pic:cNvPicPr/>
+                        </pic:nvPicPr>
+                        <pic:blipFill>
+                          <a:blip r:embed="rId36"/>
+                          <a:stretch>
+                            <a:fillRect/>
+                          </a:stretch>
+                        </pic:blipFill>
+                        <pic:spPr>
+                          <a:xfrm>
+                            <a:off x="0" y="0"/>
+                            <a:ext cx="4680000" cy="3120000"/>
+                          </a:xfrm>
+                          <a:prstGeom prst="rect"/>
+                        </pic:spPr>
+                      </pic:pic>
+                    </a:graphicData>
+                  </a:graphic>
+                </wp:inline>
+              </w:drawing>
+            </w:r>
+          </w:p>
+        </w:tc>
+      </w:tr>
+    </w:tbl>
+    <w:p>
+      <w:pPr>
+        <w:spacing w:line="240" w:lineRule="auto" w:after="120"/>
+        <w:jc w:val="center"/>
+      </w:pPr>
+      <w:r>
+        <w:rPr>
+          <w:rFonts w:ascii="Times New Roman" w:hAnsi="Times New Roman"/>
+          <w:b/>
+          <w:sz w:val="20"/>
+        </w:rPr>
+        <w:t>Gambar 4.9</w:t>
+      </w:r>
+      <w:r>
+        <w:rPr>
+          <w:rFonts w:ascii="Times New Roman" w:hAnsi="Times New Roman"/>
+          <w:b w:val="0"/>
+          <w:sz w:val="20"/>
+        </w:rPr>
+        <w:t xml:space="preserve"> Perbandingan Empat Metode Linkage</w:t>
+      </w:r>
+      <w:r>
+        <w:rPr>
+          <w:rFonts w:ascii="Times New Roman" w:hAnsi="Times New Roman"/>
+          <w:color w:val="FFFFFF"/>
+          <w:sz w:val="2"/>
+        </w:rPr>
+        <w:t xml:space="preserve"> ZF070</w:t>
+      </w:r>
+    </w:p>
+    <w:p>
+      <w:pPr>
+        <w:spacing w:line="360" w:lineRule="auto"/>
+        <w:ind w:firstLine="567"/>
+        <w:jc w:val="both"/>
+      </w:pPr>
+      <w:r>
+        <w:t>Pada Gambar 4.9 terlihat bahwa keempat metode linkage menghasilkan struktur hirarki yang serupa, yaitu tiga klaster yang sama: {A, B, C}, {D, E, F}, dan {G, H, I, J}. Perbedaan utama terletak pada skala ketinggian penggabungan. Metode single linkage menghasilkan jarak penggabungan paling rendah karena mengambil nilai minimum antar anggota, sedangkan complete linkage menghasilkan skala paling tinggi karena memilih jarak maksimum antar anggota. Metode average dan ward berada di antaranya dengan pola yang lebih halus. Karena ketiga kelompok pada data terpisah cukup jelas, pilihan metode linkage tidak mengubah hasil klaster final, melainkan hanya mempengaruhi skala ketinggian pada dendrogram. Hal ini menunjukkan bahwa pada data dengan kelompok yang terpisah baik, Agglomerative Clustering bersifat robust terhadap pilihan metode linkage.</w:t>
+      </w:r>
+    </w:p>
+    <w:p>
+      <w:r>
+        <w:br w:type="page"/>
+      </w:r>
+    </w:p>
+    <w:p>
+      <w:pPr>
+        <w:pStyle w:val="Heading2"/>
+        <w:tabs>
+          <w:tab w:pos="567" w:val="left"/>
+        </w:tabs>
+        <w:ind w:left="0"/>
+      </w:pPr>
+      <w:r>
+        <w:rPr>
+          <w:rFonts w:ascii="Times New Roman" w:hAnsi="Times New Roman" w:cs="Times New Roman" w:eastAsia="Times New Roman"/>
+        </w:rPr>
+        <w:t>4.4</w:t>
+        <w:tab/>
+        <w:t>Analisis Pengaruh Centroid Awal terhadap Outlier</w:t>
+      </w:r>
+      <w:r>
+        <w:rPr>
+          <w:rFonts w:ascii="Times New Roman" w:hAnsi="Times New Roman"/>
+          <w:color w:val="FFFFFF"/>
+          <w:sz w:val="2"/>
+        </w:rPr>
+        <w:t xml:space="preserve"> ZT071</w:t>
+      </w:r>
+    </w:p>
+    <w:p>
+      <w:pPr>
+        <w:spacing w:line="360" w:lineRule="auto"/>
+        <w:ind w:firstLine="567"/>
+        <w:jc w:val="both"/>
+      </w:pPr>
+      <w:r>
+        <w:t>Perhitungan pada subbab 4.2.1 memakai centroid awal yang berada di dalam sebaran data. Untuk menguji sensitivitas K-Means terhadap pemilihan centroid awal, dilakukan percobaan tambahan dengan menempatkan salah satu centroid awal tepat di titik terjauh (outlier) dari kerumunan data. Jarak setiap titik terhadap rata-rata data dihitung, dan diperoleh P5 = (47, 253) sebagai titik terjauh (berada di luar layer/kerumunan) serta P6 = (40, 81) sebagai titik paling sentral (di dalam layer). Dua skenario dibandingkan, dengan centroid kedua sengaja dibuat sama (C2 tetap = P2) agar perbedaan hasil murni disebabkan oleh perpindahan centroid pertama.</w:t>
+      </w:r>
+    </w:p>
+    <w:p>
+      <w:pPr>
+        <w:spacing w:line="360" w:lineRule="auto"/>
+        <w:ind w:left="567" w:hanging="567"/>
+        <w:jc w:val="both"/>
+      </w:pPr>
+      <w:r>
+        <w:t>1.</w:t>
+        <w:tab/>
+        <w:t>Skenario A (di dalam layer): centroid awal C1 = P6 (40, 81) dan C2 = P2 (47, 100).</w:t>
+      </w:r>
+    </w:p>
+    <w:p>
+      <w:pPr>
+        <w:spacing w:line="360" w:lineRule="auto"/>
+        <w:ind w:left="567" w:hanging="567"/>
+        <w:jc w:val="both"/>
+      </w:pPr>
+      <w:r>
+        <w:t>2.</w:t>
+        <w:tab/>
+        <w:t>Skenario B (di luar layer): centroid awal C1 = P5 (47, 253) (titik terjauh) dan C2 = P2 (47, 100).</w:t>
+      </w:r>
+    </w:p>
+    <w:p>
+      <w:pPr>
+        <w:spacing w:line="360" w:lineRule="auto"/>
+        <w:ind w:firstLine="567"/>
+        <w:jc w:val="both"/>
+      </w:pPr>
+      <w:r>
+        <w:t>Percobaan ini menjawab dua pertanyaan: (1) apa yang berbeda jika centroid awal diletakkan di titik terjauh/outlier, dan (2) apakah anggota klaster berubah atau tetap sama. Perbandingan kedua skenario ditampilkan pada Tabel 4.13 dan divisualisasikan pada Gambar 4.10.</w:t>
+      </w:r>
+    </w:p>
+    <w:p/>
+    <w:p>
+      <w:pPr>
+        <w:spacing w:line="240" w:lineRule="auto" w:after="120"/>
+        <w:jc w:val="left"/>
+      </w:pPr>
+      <w:r>
+        <w:rPr>
+          <w:rFonts w:ascii="Times New Roman" w:hAnsi="Times New Roman"/>
+          <w:b/>
+          <w:sz w:val="20"/>
+        </w:rPr>
+        <w:t>Tabel 4.13</w:t>
+      </w:r>
+      <w:r>
+        <w:rPr>
+          <w:rFonts w:ascii="Times New Roman" w:hAnsi="Times New Roman"/>
+          <w:b w:val="0"/>
+          <w:sz w:val="20"/>
+        </w:rPr>
+        <w:t xml:space="preserve"> Perbandingan Centroid Awal di Dalam vs di Luar Layer</w:t>
+      </w:r>
+      <w:r>
+        <w:rPr>
+          <w:rFonts w:ascii="Times New Roman" w:hAnsi="Times New Roman"/>
+          <w:color w:val="FFFFFF"/>
+          <w:sz w:val="2"/>
+        </w:rPr>
+        <w:t xml:space="preserve"> ZT072</w:t>
+      </w:r>
+    </w:p>
+    <w:tbl>
+      <w:tblPr>
+        <w:jc w:val="center"/>
+        <w:tblLook w:firstColumn="1" w:firstRow="1" w:lastColumn="0" w:lastRow="0" w:noHBand="0" w:noVBand="1" w:val="04A0"/>
+        <w:tblBorders>
+          <w:top w:val="single" w:sz="4" w:space="0" w:color="000000"/>
+          <w:left w:val="single" w:sz="4" w:space="0" w:color="000000"/>
+          <w:bottom w:val="single" w:sz="4" w:space="0" w:color="000000"/>
+          <w:right w:val="single" w:sz="4" w:space="0" w:color="000000"/>
+          <w:insideH w:val="single" w:sz="4" w:space="0" w:color="000000"/>
+          <w:insideV w:val="single" w:sz="4" w:space="0" w:color="000000"/>
+        </w:tblBorders>
+        <w:tblW w:type="pct" w:w="5000"/>
       </w:tblPr>
       <w:tblGrid>
         <w:gridCol w:w="2646"/>
@@ -18178,46 +18466,78 @@
         </w:tc>
       </w:tr>
     </w:tbl>
-    <w:p>
-      <w:pPr>
-        <w:spacing w:before="120"/>
+    <w:p/>
+    <w:tbl>
+      <w:tblPr>
         <w:jc w:val="center"/>
-      </w:pPr>
-      <w:r>
-        <w:drawing>
-          <wp:inline xmlns:a="http://schemas.openxmlformats.org/drawingml/2006/main" xmlns:pic="http://schemas.openxmlformats.org/drawingml/2006/picture">
-            <wp:extent cx="5040000" cy="2168372"/>
-            <wp:docPr id="26" name="Picture 26"/>
-            <wp:cNvGraphicFramePr>
-              <a:graphicFrameLocks noChangeAspect="1"/>
-            </wp:cNvGraphicFramePr>
-            <a:graphic>
-              <a:graphicData uri="http://schemas.openxmlformats.org/drawingml/2006/picture">
-                <pic:pic>
-                  <pic:nvPicPr>
-                    <pic:cNvPr id="0" name="km_terjauh.png"/>
-                    <pic:cNvPicPr/>
-                  </pic:nvPicPr>
-                  <pic:blipFill>
-                    <a:blip r:embed="rId37"/>
-                    <a:stretch>
-                      <a:fillRect/>
-                    </a:stretch>
-                  </pic:blipFill>
-                  <pic:spPr>
-                    <a:xfrm>
-                      <a:off x="0" y="0"/>
-                      <a:ext cx="5040000" cy="2168372"/>
-                    </a:xfrm>
-                    <a:prstGeom prst="rect"/>
-                  </pic:spPr>
-                </pic:pic>
-              </a:graphicData>
-            </a:graphic>
-          </wp:inline>
-        </w:drawing>
-      </w:r>
-    </w:p>
+        <w:tblLook w:firstColumn="1" w:firstRow="1" w:lastColumn="0" w:lastRow="0" w:noHBand="0" w:noVBand="1" w:val="04A0"/>
+        <w:tblBorders>
+          <w:top w:val="single" w:sz="4" w:space="0" w:color="000000"/>
+          <w:left w:val="single" w:sz="4" w:space="0" w:color="000000"/>
+          <w:bottom w:val="single" w:sz="4" w:space="0" w:color="000000"/>
+          <w:right w:val="single" w:sz="4" w:space="0" w:color="000000"/>
+          <w:insideH w:val="single" w:sz="4" w:space="0" w:color="000000"/>
+          <w:insideV w:val="single" w:sz="4" w:space="0" w:color="000000"/>
+        </w:tblBorders>
+        <w:tblW w:type="pct" w:w="5000"/>
+        <w:tblCellMar>
+          <w:top w:w="40" w:type="dxa"/>
+          <w:bottom w:w="40" w:type="dxa"/>
+          <w:left w:w="40" w:type="dxa"/>
+          <w:right w:w="40" w:type="dxa"/>
+        </w:tblCellMar>
+      </w:tblPr>
+      <w:tblGrid>
+        <w:gridCol w:w="7937"/>
+      </w:tblGrid>
+      <w:tr>
+        <w:tc>
+          <w:tcPr>
+            <w:tcW w:type="dxa" w:w="7937"/>
+          </w:tcPr>
+          <w:p>
+            <w:pPr>
+              <w:spacing w:before="0" w:after="0"/>
+              <w:jc w:val="center"/>
+            </w:pPr>
+            <w:r>
+              <w:drawing>
+                <wp:inline xmlns:a="http://schemas.openxmlformats.org/drawingml/2006/main" xmlns:pic="http://schemas.openxmlformats.org/drawingml/2006/picture">
+                  <wp:extent cx="4860000" cy="2090930"/>
+                  <wp:docPr id="26" name="Picture 26"/>
+                  <wp:cNvGraphicFramePr>
+                    <a:graphicFrameLocks noChangeAspect="1"/>
+                  </wp:cNvGraphicFramePr>
+                  <a:graphic>
+                    <a:graphicData uri="http://schemas.openxmlformats.org/drawingml/2006/picture">
+                      <pic:pic>
+                        <pic:nvPicPr>
+                          <pic:cNvPr id="0" name="km_terjauh.png"/>
+                          <pic:cNvPicPr/>
+                        </pic:nvPicPr>
+                        <pic:blipFill>
+                          <a:blip r:embed="rId37"/>
+                          <a:stretch>
+                            <a:fillRect/>
+                          </a:stretch>
+                        </pic:blipFill>
+                        <pic:spPr>
+                          <a:xfrm>
+                            <a:off x="0" y="0"/>
+                            <a:ext cx="4860000" cy="2090930"/>
+                          </a:xfrm>
+                          <a:prstGeom prst="rect"/>
+                        </pic:spPr>
+                      </pic:pic>
+                    </a:graphicData>
+                  </a:graphic>
+                </wp:inline>
+              </w:drawing>
+            </w:r>
+          </w:p>
+        </w:tc>
+      </w:tr>
+    </w:tbl>
     <w:p>
       <w:pPr>
         <w:spacing w:line="240" w:lineRule="auto" w:after="120"/>

</xml_diff>

<commit_message>
docs: hilangkan halaman kosong (widow) - subbab 4.4 mengalir tanpa page break paksa
</commit_message>
<xml_diff>
--- a/Laporan_Kelompok10_UTS_DataMining_TitikTerjauh.docx
+++ b/Laporan_Kelompok10_UTS_DataMining_TitikTerjauh.docx
@@ -938,7 +938,7 @@
       <w:r>
         <w:t>4.4 Analisis Pengaruh Centroid Awal terhadap Outlier</w:t>
         <w:tab/>
-        <w:t>30</w:t>
+        <w:t>29</w:t>
       </w:r>
     </w:p>
     <w:p>
@@ -955,7 +955,7 @@
         </w:rPr>
         <w:t>BAB V PENUTUP</w:t>
         <w:tab/>
-        <w:t>32</w:t>
+        <w:t>31</w:t>
       </w:r>
     </w:p>
     <w:p>
@@ -969,7 +969,7 @@
       <w:r>
         <w:t>5.1 Kesimpulan</w:t>
         <w:tab/>
-        <w:t>32</w:t>
+        <w:t>31</w:t>
       </w:r>
     </w:p>
     <w:p>
@@ -983,7 +983,7 @@
       <w:r>
         <w:t>5.2 Saran</w:t>
         <w:tab/>
-        <w:t>33</w:t>
+        <w:t>32</w:t>
       </w:r>
     </w:p>
     <w:p>
@@ -1000,7 +1000,7 @@
         </w:rPr>
         <w:t>DAFTAR PUSTAKA</w:t>
         <w:tab/>
-        <w:t>34</w:t>
+        <w:t>33</w:t>
       </w:r>
     </w:p>
     <w:p>
@@ -1188,7 +1188,7 @@
         </w:rPr>
         <w:t>Gambar 4.10 Perbandingan Centroid Awal di Dalam vs di Luar Layer</w:t>
         <w:tab/>
-        <w:t>31</w:t>
+        <w:t>30</w:t>
       </w:r>
     </w:p>
     <w:p>
@@ -1496,7 +1496,7 @@
         </w:rPr>
         <w:t>Tabel 4.13 Perbandingan Centroid Awal di Dalam vs di Luar Layer</w:t>
         <w:tab/>
-        <w:t>30</w:t>
+        <w:t>29</w:t>
       </w:r>
     </w:p>
     <w:p>
@@ -17716,11 +17716,6 @@
       </w:pPr>
       <w:r>
         <w:t>Pada Gambar 4.9 terlihat bahwa keempat metode linkage menghasilkan struktur hirarki yang serupa, yaitu tiga klaster yang sama: {A, B, C}, {D, E, F}, dan {G, H, I, J}. Perbedaan utama terletak pada skala ketinggian penggabungan. Metode single linkage menghasilkan jarak penggabungan paling rendah karena mengambil nilai minimum antar anggota, sedangkan complete linkage menghasilkan skala paling tinggi karena memilih jarak maksimum antar anggota. Metode average dan ward berada di antaranya dengan pola yang lebih halus. Karena ketiga kelompok pada data terpisah cukup jelas, pilihan metode linkage tidak mengubah hasil klaster final, melainkan hanya mempengaruhi skala ketinggian pada dendrogram. Hal ini menunjukkan bahwa pada data dengan kelompok yang terpisah baik, Agglomerative Clustering bersifat robust terhadap pilihan metode linkage.</w:t>
-      </w:r>
-    </w:p>
-    <w:p>
-      <w:r>
-        <w:br w:type="page"/>
       </w:r>
     </w:p>
     <w:p>

</xml_diff>